<commit_message>
Add docker-compose configuration for PostgreSQL, RabbitMQ, and Redis services
</commit_message>
<xml_diff>
--- a/Documents/Project CityPeople.docx
+++ b/Documents/Project CityPeople.docx
@@ -203,7 +203,76 @@
         <w:rPr>
           <w:rtl/>
         </w:rPr>
-        <w:t>הזנת שם, תאריך לידה (לחישוב גיל וסינון קטינים או בגירים) ועיר מגורים</w:t>
+        <w:t>ה</w:t>
+      </w:r>
+      <w:r>
+        <w:rPr>
+          <w:rtl/>
+        </w:rPr>
+        <w:t>זנת שם, תאריך לידה (לחישוב גיל וסינון קטינים או בגירים) ועיר מגורים</w:t>
+      </w:r>
+      <w:r>
+        <w:t>.</w:t>
+      </w:r>
+      <w:r>
+        <w:rPr>
+          <w:rFonts w:hint="cs"/>
+          <w:rtl/>
+        </w:rPr>
+        <w:t xml:space="preserve"> </w:t>
+      </w:r>
+      <w:r>
+        <w:t>(</w:t>
+      </w:r>
+      <w:proofErr w:type="spellStart"/>
+      <w:r>
+        <w:rPr>
+          <w:rtl/>
+        </w:rPr>
+        <w:t>הערה</w:t>
+      </w:r>
+      <w:proofErr w:type="spellEnd"/>
+      <w:r>
+        <w:rPr>
+          <w:rtl/>
+        </w:rPr>
+        <w:t xml:space="preserve"> טכנית: שדה העיר יחובר לשירות</w:t>
+      </w:r>
+      <w:r>
+        <w:t xml:space="preserve"> Geocoding </w:t>
+      </w:r>
+      <w:r>
+        <w:rPr>
+          <w:rtl/>
+        </w:rPr>
+        <w:t>שימיר את שם העיר שבחר המשתמש לקואורדינטות</w:t>
+      </w:r>
+      <w:r>
+        <w:t xml:space="preserve"> GPS </w:t>
+      </w:r>
+      <w:r>
+        <w:rPr>
+          <w:rtl/>
+        </w:rPr>
+        <w:t>מדויקות של קווי רוחב ואורך, אותן נשמור במסד הנתונים לטובת חיפושי הרדיוס בפיד הגילוי</w:t>
+      </w:r>
+      <w:r>
+        <w:t xml:space="preserve">). </w:t>
+      </w:r>
+      <w:r>
+        <w:rPr>
+          <w:rtl/>
+        </w:rPr>
+        <w:t>לחלופין, ניתן להוסיף כפתור "אתר את מיקומי" המבקש הרשאת</w:t>
+      </w:r>
+      <w:r>
+        <w:t xml:space="preserve"> GPS </w:t>
+      </w:r>
+      <w:r>
+        <w:rPr>
+          <w:rtl/>
+        </w:rPr>
+        <w:t>מהמכשיר ומחלץ את העיר אוטומטית</w:t>
       </w:r>
       <w:r>
         <w:t>.</w:t>
@@ -546,10 +615,32 @@
         <w:rPr>
           <w:rtl/>
         </w:rPr>
-        <w:t>רך ביניהם. טאב "הקבוצות שלי" יציג אשכולות דיון מקבוצות שהמשתמש חבר בהן, וטאב "פיד גילוי" יציג תוכן מומלץ (למשל, קבוצות של "סטודנטים בעפולה" או תחומי עניין דומים). כל פוסט יוצג ככרטיסייה מודרנית עם תמונת רקע, כותרת, ולחצני אינטראקציה. לחיצה על שם קבוצה בתוך הפוסט תוביל למסך הפנימי של אותה קבוצה</w:t>
-      </w:r>
-      <w:r>
-        <w:t>.</w:t>
+        <w:t xml:space="preserve">רך ביניהם. טאב "הקבוצות שלי" יציג אשכולות דיון מקבוצות שהמשתמש חבר בהן, וטאב "פיד גילוי" יציג תוכן מומלץ (למשל, קבוצות של "סטודנטים בעפולה" או תחומי עניין דומים). </w:t>
+      </w:r>
+      <w:r>
+        <w:rPr>
+          <w:rtl/>
+        </w:rPr>
+        <w:t xml:space="preserve">כל פוסט יוצג ככרטיסייה מודרנית עם תמונת רקע, כותרת, ולחצני </w:t>
+      </w:r>
+      <w:r>
+        <w:rPr>
+          <w:rtl/>
+        </w:rPr>
+        <w:lastRenderedPageBreak/>
+        <w:t>אינטראקציה</w:t>
+      </w:r>
+      <w:r>
+        <w:t xml:space="preserve">. </w:t>
+      </w:r>
+      <w:r>
+        <w:rPr>
+          <w:rtl/>
+        </w:rPr>
+        <w:t>בפינת כל כרטיסייה יופיע כפתור "אפשרויות" (שלוש נקודות) שיפתח תפריט תחתון עם האפשרויות "דווח על פוסט" ו"חסום משתמש</w:t>
+      </w:r>
+      <w:r>
+        <w:t>".</w:t>
       </w:r>
     </w:p>
     <w:p>
@@ -602,7 +693,6 @@
           <w:bCs/>
           <w:rtl/>
         </w:rPr>
-        <w:lastRenderedPageBreak/>
         <w:t>מסך התראות ופעילות</w:t>
       </w:r>
       <w:r>
@@ -755,14 +845,38 @@
       <w:r>
         <w:t>(</w:t>
       </w:r>
-      <w:r>
-        <w:rPr>
-          <w:rtl/>
-        </w:rPr>
-        <w:t>עריכת פרטים, מחיקת חשבון, והתנתקות</w:t>
+      <w:proofErr w:type="spellStart"/>
+      <w:r>
+        <w:rPr>
+          <w:rtl/>
+        </w:rPr>
+        <w:t>עריכת</w:t>
+      </w:r>
+      <w:proofErr w:type="spellEnd"/>
+      <w:r>
+        <w:rPr>
+          <w:rtl/>
+        </w:rPr>
+        <w:t xml:space="preserve"> פרטים, מחיקת חשבון, והתנתקות</w:t>
       </w:r>
       <w:r>
         <w:t>).</w:t>
+      </w:r>
+      <w:r>
+        <w:rPr>
+          <w:rFonts w:hint="cs"/>
+          <w:rtl/>
+        </w:rPr>
+        <w:t xml:space="preserve"> עבור פרופיל של אדם אחר, </w:t>
+      </w:r>
+      <w:r>
+        <w:rPr>
+          <w:rtl/>
+        </w:rPr>
+        <w:t>בפינה העליונה של המסך יופיע כפתור אפשרויות המאפשר "דיווח על משתמש" או "חסימת משתמש</w:t>
+      </w:r>
+      <w:r>
+        <w:t>".</w:t>
       </w:r>
     </w:p>
     <w:p>
@@ -998,54 +1112,6 @@
       <w:pPr>
         <w:bidi/>
         <w:rPr>
-          <w:rtl/>
-        </w:rPr>
-      </w:pPr>
-    </w:p>
-    <w:p>
-      <w:pPr>
-        <w:bidi/>
-        <w:rPr>
-          <w:rtl/>
-        </w:rPr>
-      </w:pPr>
-    </w:p>
-    <w:p>
-      <w:pPr>
-        <w:bidi/>
-        <w:rPr>
-          <w:rtl/>
-        </w:rPr>
-      </w:pPr>
-    </w:p>
-    <w:p>
-      <w:pPr>
-        <w:bidi/>
-        <w:rPr>
-          <w:rtl/>
-        </w:rPr>
-      </w:pPr>
-    </w:p>
-    <w:p>
-      <w:pPr>
-        <w:bidi/>
-        <w:rPr>
-          <w:rtl/>
-        </w:rPr>
-      </w:pPr>
-    </w:p>
-    <w:p>
-      <w:pPr>
-        <w:bidi/>
-        <w:rPr>
-          <w:rtl/>
-        </w:rPr>
-      </w:pPr>
-    </w:p>
-    <w:p>
-      <w:pPr>
-        <w:bidi/>
-        <w:rPr>
           <w:b/>
           <w:bCs/>
           <w:sz w:val="32"/>
@@ -1169,6 +1235,7 @@
         </w:rPr>
         <w:t xml:space="preserve"> Users (</w:t>
       </w:r>
+      <w:proofErr w:type="spellStart"/>
       <w:r>
         <w:rPr>
           <w:b/>
@@ -1177,6 +1244,7 @@
         </w:rPr>
         <w:t>משתמשים</w:t>
       </w:r>
+      <w:proofErr w:type="spellEnd"/>
       <w:r>
         <w:rPr>
           <w:b/>
@@ -1209,7 +1277,34 @@
         <w:rPr>
           <w:rtl/>
         </w:rPr>
-        <w:t>קישורים לאינסטגרם ולטיקטוק, עמודת הגדרות משתמש מסוג</w:t>
+        <w:t>קישורים לאינסטגרם ולטיקטוק</w:t>
+      </w:r>
+      <w:r>
+        <w:t xml:space="preserve">, </w:t>
+      </w:r>
+      <w:r>
+        <w:rPr>
+          <w:b/>
+          <w:bCs/>
+          <w:rtl/>
+        </w:rPr>
+        <w:t>כתובת תמונת פרופיל</w:t>
+      </w:r>
+      <w:r>
+        <w:rPr>
+          <w:b/>
+          <w:bCs/>
+        </w:rPr>
+        <w:t xml:space="preserve"> (Profile Image URL)</w:t>
+      </w:r>
+      <w:r>
+        <w:t xml:space="preserve">, </w:t>
+      </w:r>
+      <w:r>
+        <w:rPr>
+          <w:rtl/>
+        </w:rPr>
+        <w:t>עמודת הגדרות משתמש מסוג</w:t>
       </w:r>
       <w:r>
         <w:t xml:space="preserve"> JSONB </w:t>
@@ -1245,15 +1340,41 @@
           <w:b/>
           <w:bCs/>
         </w:rPr>
-        <w:t xml:space="preserve"> Device_Tokens (</w:t>
-      </w:r>
-      <w:r>
-        <w:rPr>
-          <w:b/>
-          <w:bCs/>
-          <w:rtl/>
-        </w:rPr>
-        <w:t>ניהול מכשירים והתראות</w:t>
+        <w:t xml:space="preserve"> </w:t>
+      </w:r>
+      <w:proofErr w:type="spellStart"/>
+      <w:r>
+        <w:rPr>
+          <w:b/>
+          <w:bCs/>
+        </w:rPr>
+        <w:t>Device_Tokens</w:t>
+      </w:r>
+      <w:proofErr w:type="spellEnd"/>
+      <w:r>
+        <w:rPr>
+          <w:b/>
+          <w:bCs/>
+        </w:rPr>
+        <w:t xml:space="preserve"> (</w:t>
+      </w:r>
+      <w:proofErr w:type="spellStart"/>
+      <w:r>
+        <w:rPr>
+          <w:b/>
+          <w:bCs/>
+          <w:rtl/>
+        </w:rPr>
+        <w:t>ניהול</w:t>
+      </w:r>
+      <w:proofErr w:type="spellEnd"/>
+      <w:r>
+        <w:rPr>
+          <w:b/>
+          <w:bCs/>
+          <w:rtl/>
+        </w:rPr>
+        <w:t xml:space="preserve"> מכשירים והתראות</w:t>
       </w:r>
       <w:r>
         <w:rPr>
@@ -1307,13 +1428,23 @@
         </w:rPr>
         <w:t xml:space="preserve"> Notifications (</w:t>
       </w:r>
-      <w:r>
-        <w:rPr>
-          <w:b/>
-          <w:bCs/>
-          <w:rtl/>
-        </w:rPr>
-        <w:t>התראות פנים</w:t>
+      <w:proofErr w:type="spellStart"/>
+      <w:r>
+        <w:rPr>
+          <w:b/>
+          <w:bCs/>
+          <w:rtl/>
+        </w:rPr>
+        <w:t>התראות</w:t>
+      </w:r>
+      <w:proofErr w:type="spellEnd"/>
+      <w:r>
+        <w:rPr>
+          <w:b/>
+          <w:bCs/>
+          <w:rtl/>
+        </w:rPr>
+        <w:t xml:space="preserve"> פנים</w:t>
       </w:r>
       <w:r>
         <w:rPr>
@@ -1458,15 +1589,41 @@
           <w:b/>
           <w:bCs/>
         </w:rPr>
-        <w:t xml:space="preserve"> Threads (</w:t>
-      </w:r>
-      <w:r>
-        <w:rPr>
-          <w:b/>
-          <w:bCs/>
-          <w:rtl/>
-        </w:rPr>
-        <w:t>פוסטים ודיונים</w:t>
+        <w:t xml:space="preserve"> </w:t>
+      </w:r>
+      <w:proofErr w:type="spellStart"/>
+      <w:r>
+        <w:rPr>
+          <w:b/>
+          <w:bCs/>
+        </w:rPr>
+        <w:t>Group_Invitations</w:t>
+      </w:r>
+      <w:proofErr w:type="spellEnd"/>
+      <w:r>
+        <w:rPr>
+          <w:b/>
+          <w:bCs/>
+        </w:rPr>
+        <w:t xml:space="preserve"> (</w:t>
+      </w:r>
+      <w:proofErr w:type="spellStart"/>
+      <w:r>
+        <w:rPr>
+          <w:b/>
+          <w:bCs/>
+          <w:rtl/>
+        </w:rPr>
+        <w:t>הזמנות</w:t>
+      </w:r>
+      <w:proofErr w:type="spellEnd"/>
+      <w:r>
+        <w:rPr>
+          <w:b/>
+          <w:bCs/>
+          <w:rtl/>
+        </w:rPr>
+        <w:t xml:space="preserve"> לקבוצות</w:t>
       </w:r>
       <w:r>
         <w:rPr>
@@ -1482,16 +1639,7 @@
         <w:rPr>
           <w:rtl/>
         </w:rPr>
-        <w:t>תכיל את מזהה הקבוצה, מזהה המחבר, תוכן הטקסט, כתובת תמונת הרקע, מידות התמונה</w:t>
-      </w:r>
-      <w:r>
-        <w:t xml:space="preserve"> (Aspect Ratio) </w:t>
-      </w:r>
-      <w:r>
-        <w:rPr>
-          <w:rtl/>
-        </w:rPr>
-        <w:t>לטעינה חלקה בממשק, מונים כוללים ללייקים ותגובות, ועמודת מחיקה רכה</w:t>
+        <w:t>טבלה זו תנהל את ההזמנות הממתינות. היא תכיל את מזהה המשתמש המזמין, מזהה המשתמש המוזמן, מזהה הקבוצה, סטטוס ההזמנה (ממתין, אושר, נדחה), ותאריך יצירה</w:t>
       </w:r>
       <w:r>
         <w:t>.</w:t>
@@ -1518,15 +1666,25 @@
           <w:b/>
           <w:bCs/>
         </w:rPr>
-        <w:t xml:space="preserve"> Thread_Comments (</w:t>
-      </w:r>
-      <w:r>
-        <w:rPr>
-          <w:b/>
-          <w:bCs/>
-          <w:rtl/>
-        </w:rPr>
-        <w:t>תגובות לפוסטים</w:t>
+        <w:t xml:space="preserve"> Threads (</w:t>
+      </w:r>
+      <w:proofErr w:type="spellStart"/>
+      <w:r>
+        <w:rPr>
+          <w:b/>
+          <w:bCs/>
+          <w:rtl/>
+        </w:rPr>
+        <w:t>פוסטים</w:t>
+      </w:r>
+      <w:proofErr w:type="spellEnd"/>
+      <w:r>
+        <w:rPr>
+          <w:b/>
+          <w:bCs/>
+          <w:rtl/>
+        </w:rPr>
+        <w:t xml:space="preserve"> ודיונים</w:t>
       </w:r>
       <w:r>
         <w:rPr>
@@ -1542,7 +1700,127 @@
         <w:rPr>
           <w:rtl/>
         </w:rPr>
-        <w:t>תכיל מזהה פוסט, מזהה מחבר התגובה, תוכן הטקסט של התגובה, כתובת תמונה אופציונלית למגיבים עם מדיה, מידות התמונה, ותאריך יצירה</w:t>
+        <w:t>תכיל את מזהה הקבוצה, מזהה המחבר, תוכן הטקסט</w:t>
+      </w:r>
+      <w:r>
+        <w:t xml:space="preserve">, </w:t>
+      </w:r>
+      <w:r>
+        <w:rPr>
+          <w:rtl/>
+        </w:rPr>
+        <w:t>סוג רקע</w:t>
+      </w:r>
+      <w:r>
+        <w:t xml:space="preserve"> (Background Type </w:t>
+      </w:r>
+      <w:r>
+        <w:rPr>
+          <w:rtl/>
+        </w:rPr>
+        <w:t>בערכים</w:t>
+      </w:r>
+      <w:r>
+        <w:t xml:space="preserve">: Image </w:t>
+      </w:r>
+      <w:r>
+        <w:rPr>
+          <w:rtl/>
+        </w:rPr>
+        <w:t>או</w:t>
+      </w:r>
+      <w:r>
+        <w:t xml:space="preserve"> </w:t>
+      </w:r>
+      <w:proofErr w:type="spellStart"/>
+      <w:r>
+        <w:t>Color</w:t>
+      </w:r>
+      <w:proofErr w:type="spellEnd"/>
+      <w:r>
+        <w:t xml:space="preserve">), </w:t>
+      </w:r>
+      <w:r>
+        <w:rPr>
+          <w:rtl/>
+        </w:rPr>
+        <w:t>ערך הרקע</w:t>
+      </w:r>
+      <w:r>
+        <w:t xml:space="preserve"> (Background Value </w:t>
+      </w:r>
+      <w:r>
+        <w:rPr>
+          <w:rtl/>
+        </w:rPr>
+        <w:t>המכיל כתובת</w:t>
+      </w:r>
+      <w:r>
+        <w:t xml:space="preserve"> URL </w:t>
+      </w:r>
+      <w:r>
+        <w:rPr>
+          <w:rtl/>
+        </w:rPr>
+        <w:t>לתמונה או קוד</w:t>
+      </w:r>
+      <w:r>
+        <w:t xml:space="preserve"> HEX </w:t>
+      </w:r>
+      <w:r>
+        <w:rPr>
+          <w:rtl/>
+        </w:rPr>
+        <w:t>לצבע</w:t>
+      </w:r>
+      <w:r>
+        <w:t xml:space="preserve">), </w:t>
+      </w:r>
+      <w:r>
+        <w:rPr>
+          <w:rtl/>
+        </w:rPr>
+        <w:t>מידות התמונה</w:t>
+      </w:r>
+      <w:r>
+        <w:t xml:space="preserve"> (Aspect Ratio) </w:t>
+      </w:r>
+      <w:r>
+        <w:rPr>
+          <w:rtl/>
+        </w:rPr>
+        <w:t>לטעינה חלקה בממשק,</w:t>
+      </w:r>
+      <w:r>
+        <w:rPr>
+          <w:rFonts w:hint="cs"/>
+          <w:rtl/>
+        </w:rPr>
+        <w:t xml:space="preserve"> </w:t>
+      </w:r>
+      <w:r>
+        <w:rPr>
+          <w:rtl/>
+        </w:rPr>
+        <w:t>סטטוס סינון</w:t>
+      </w:r>
+      <w:r>
+        <w:t xml:space="preserve"> (Moderation Status </w:t>
+      </w:r>
+      <w:r>
+        <w:rPr>
+          <w:rtl/>
+        </w:rPr>
+        <w:t>בערכים</w:t>
+      </w:r>
+      <w:r>
+        <w:t>: Pending, Approved, Rejected),</w:t>
+      </w:r>
+      <w:r>
+        <w:rPr>
+          <w:rtl/>
+        </w:rPr>
+        <w:t xml:space="preserve"> מונים כוללים ללייקים ותגובות, ועמודת מחיקה רכה</w:t>
       </w:r>
       <w:r>
         <w:t>.</w:t>
@@ -1569,15 +1847,41 @@
           <w:b/>
           <w:bCs/>
         </w:rPr>
-        <w:t xml:space="preserve"> Thread_Likes (</w:t>
-      </w:r>
-      <w:r>
-        <w:rPr>
-          <w:b/>
-          <w:bCs/>
-          <w:rtl/>
-        </w:rPr>
-        <w:t>מעקב לייקים</w:t>
+        <w:t xml:space="preserve"> </w:t>
+      </w:r>
+      <w:proofErr w:type="spellStart"/>
+      <w:r>
+        <w:rPr>
+          <w:b/>
+          <w:bCs/>
+        </w:rPr>
+        <w:t>Thread_Comments</w:t>
+      </w:r>
+      <w:proofErr w:type="spellEnd"/>
+      <w:r>
+        <w:rPr>
+          <w:b/>
+          <w:bCs/>
+        </w:rPr>
+        <w:t xml:space="preserve"> (</w:t>
+      </w:r>
+      <w:proofErr w:type="spellStart"/>
+      <w:r>
+        <w:rPr>
+          <w:b/>
+          <w:bCs/>
+          <w:rtl/>
+        </w:rPr>
+        <w:t>תגובות</w:t>
+      </w:r>
+      <w:proofErr w:type="spellEnd"/>
+      <w:r>
+        <w:rPr>
+          <w:b/>
+          <w:bCs/>
+          <w:rtl/>
+        </w:rPr>
+        <w:t xml:space="preserve"> לפוסטים</w:t>
       </w:r>
       <w:r>
         <w:rPr>
@@ -1593,7 +1897,35 @@
         <w:rPr>
           <w:rtl/>
         </w:rPr>
-        <w:t>טבלת גישור שתשמור מזהה פוסט ומזהה משתמש, כדי לאכוף ברמת מסד הנתונים שמשתמש לא יכול לעשות יותר מלייק אחד לאותו פוסט</w:t>
+        <w:t>תכיל מזהה פוסט, מזהה מחבר התגובה, תוכן הטקסט של התגובה, כתובת תמונה אופציונלית למגיבים עם מדיה, מידות התמונ</w:t>
+      </w:r>
+      <w:r>
+        <w:rPr>
+          <w:rtl/>
+        </w:rPr>
+        <w:t>ה,</w:t>
+      </w:r>
+      <w:r>
+        <w:rPr>
+          <w:rFonts w:hint="cs"/>
+          <w:rtl/>
+        </w:rPr>
+        <w:t xml:space="preserve"> </w:t>
+      </w:r>
+      <w:r>
+        <w:rPr>
+          <w:rtl/>
+        </w:rPr>
+        <w:t>סטטוס סינון</w:t>
+      </w:r>
+      <w:r>
+        <w:t xml:space="preserve"> (Pending, Approved, Rejected),</w:t>
+      </w:r>
+      <w:r>
+        <w:rPr>
+          <w:rtl/>
+        </w:rPr>
+        <w:t xml:space="preserve"> ותאריך יצירה</w:t>
       </w:r>
       <w:r>
         <w:t>.</w:t>
@@ -1620,15 +1952,15 @@
           <w:b/>
           <w:bCs/>
         </w:rPr>
-        <w:t xml:space="preserve"> Conversations (</w:t>
-      </w:r>
-      <w:r>
-        <w:rPr>
-          <w:b/>
-          <w:bCs/>
-          <w:rtl/>
-        </w:rPr>
-        <w:t>תיבות שיחה</w:t>
+        <w:t xml:space="preserve"> Thread_Likes (</w:t>
+      </w:r>
+      <w:r>
+        <w:rPr>
+          <w:b/>
+          <w:bCs/>
+          <w:rtl/>
+        </w:rPr>
+        <w:t>מעקב לייקים</w:t>
       </w:r>
       <w:r>
         <w:rPr>
@@ -1644,7 +1976,7 @@
         <w:rPr>
           <w:rtl/>
         </w:rPr>
-        <w:t>תרכז את השיחות הפעילות בין שני משתמשים, ותשמור את מזהה ההודעה האחרונה שנשלחה ותאריך עדכון אחרון. נתונים אלו קריטיים להצגה מהירה של מסך רשימת הצ'אטים</w:t>
+        <w:t>טבלת גישור שתשמור מזהה פוסט ומזהה משתמש, כדי לאכוף ברמת מסד הנתונים שמשתמש לא יכול לעשות יותר מלייק אחד לאותו פוסט</w:t>
       </w:r>
       <w:r>
         <w:t>.</w:t>
@@ -1671,15 +2003,15 @@
           <w:b/>
           <w:bCs/>
         </w:rPr>
-        <w:t xml:space="preserve"> Messages (</w:t>
-      </w:r>
-      <w:r>
-        <w:rPr>
-          <w:b/>
-          <w:bCs/>
-          <w:rtl/>
-        </w:rPr>
-        <w:t>הודעות פרטיות</w:t>
+        <w:t xml:space="preserve"> Conversations (</w:t>
+      </w:r>
+      <w:r>
+        <w:rPr>
+          <w:b/>
+          <w:bCs/>
+          <w:rtl/>
+        </w:rPr>
+        <w:t>תיבות שיחה</w:t>
       </w:r>
       <w:r>
         <w:rPr>
@@ -1695,7 +2027,7 @@
         <w:rPr>
           <w:rtl/>
         </w:rPr>
-        <w:t>תכיל מזהה שייכות לשיחה ספציפית, מזהה שולח, מזהה מקבל, תוכן ההודעה, כתובת תמונה מצורפת, מידות התמונה, וסטטוס הודעה המנהל את מנגנון תיבת הלא מאושרים</w:t>
+        <w:t>תרכז את השיחות הפעילות בין שני משתמשים, ותשמור את מזהה ההודעה האחרונה שנשלחה ותאריך עדכון אחרון. נתונים אלו קריטיים להצגה מהירה של מסך רשימת הצ'אטים</w:t>
       </w:r>
       <w:r>
         <w:t>.</w:t>
@@ -1715,6 +2047,7 @@
           <w:bCs/>
           <w:rtl/>
         </w:rPr>
+        <w:lastRenderedPageBreak/>
         <w:t>טבלת</w:t>
       </w:r>
       <w:r>
@@ -1722,15 +2055,15 @@
           <w:b/>
           <w:bCs/>
         </w:rPr>
-        <w:t xml:space="preserve"> Reports (</w:t>
-      </w:r>
-      <w:r>
-        <w:rPr>
-          <w:b/>
-          <w:bCs/>
-          <w:rtl/>
-        </w:rPr>
-        <w:t>דיווחי משתמשים</w:t>
+        <w:t xml:space="preserve"> Messages (</w:t>
+      </w:r>
+      <w:r>
+        <w:rPr>
+          <w:b/>
+          <w:bCs/>
+          <w:rtl/>
+        </w:rPr>
+        <w:t>הודעות פרטיות</w:t>
       </w:r>
       <w:r>
         <w:rPr>
@@ -1746,7 +2079,7 @@
         <w:rPr>
           <w:rtl/>
         </w:rPr>
-        <w:t>תכיל את מזהה המדווח, מזהה התוכן הפוגעני (מזהה של פוסט או מזהה משתמש אחר), סיבת הדיווח, וסטטוס הטיפול במערכת</w:t>
+        <w:t>תכיל מזהה שייכות לשיחה ספציפית, מזהה שולח, מזהה מקבל, תוכן ההודעה, כתובת תמונה מצורפת, מידות התמונה, וסטטוס הודעה המנהל את מנגנון תיבת הלא מאושרים</w:t>
       </w:r>
       <w:r>
         <w:t>.</w:t>
@@ -1773,6 +2106,57 @@
           <w:b/>
           <w:bCs/>
         </w:rPr>
+        <w:t xml:space="preserve"> Reports (</w:t>
+      </w:r>
+      <w:r>
+        <w:rPr>
+          <w:b/>
+          <w:bCs/>
+          <w:rtl/>
+        </w:rPr>
+        <w:t>דיווחי משתמשים</w:t>
+      </w:r>
+      <w:r>
+        <w:rPr>
+          <w:b/>
+          <w:bCs/>
+        </w:rPr>
+        <w:t>):</w:t>
+      </w:r>
+      <w:r>
+        <w:t xml:space="preserve"> </w:t>
+      </w:r>
+      <w:r>
+        <w:rPr>
+          <w:rtl/>
+        </w:rPr>
+        <w:t>תכיל את מזהה המדווח, מזהה התוכן הפוגעני (מזהה של פוסט או מזהה משתמש אחר), סיבת הדיווח, וסטטוס הטיפול במערכת</w:t>
+      </w:r>
+      <w:r>
+        <w:t>.</w:t>
+      </w:r>
+    </w:p>
+    <w:p>
+      <w:pPr>
+        <w:numPr>
+          <w:ilvl w:val="0"/>
+          <w:numId w:val="10"/>
+        </w:numPr>
+        <w:bidi/>
+      </w:pPr>
+      <w:r>
+        <w:rPr>
+          <w:b/>
+          <w:bCs/>
+          <w:rtl/>
+        </w:rPr>
+        <w:t>טבלת</w:t>
+      </w:r>
+      <w:r>
+        <w:rPr>
+          <w:b/>
+          <w:bCs/>
+        </w:rPr>
         <w:t xml:space="preserve"> Blocked_Users (</w:t>
       </w:r>
       <w:r>
@@ -1847,7 +2231,6 @@
         <w:rPr>
           <w:rtl/>
         </w:rPr>
-        <w:lastRenderedPageBreak/>
         <w:t>אינדקסים מרחביים</w:t>
       </w:r>
       <w:r>
@@ -2094,86 +2477,22 @@
     </w:p>
     <w:p>
       <w:pPr>
-        <w:rPr>
-          <w:rtl/>
-        </w:rPr>
-      </w:pPr>
-    </w:p>
-    <w:p>
-      <w:pPr>
-        <w:rPr>
-          <w:rtl/>
-        </w:rPr>
-      </w:pPr>
-    </w:p>
-    <w:p>
-      <w:pPr>
-        <w:rPr>
-          <w:rtl/>
-        </w:rPr>
-      </w:pPr>
-    </w:p>
-    <w:p>
-      <w:pPr>
-        <w:rPr>
-          <w:rtl/>
-        </w:rPr>
-      </w:pPr>
-    </w:p>
-    <w:p>
-      <w:pPr>
-        <w:rPr>
-          <w:rtl/>
-        </w:rPr>
-      </w:pPr>
-    </w:p>
-    <w:p>
-      <w:pPr>
-        <w:rPr>
-          <w:rtl/>
-        </w:rPr>
-      </w:pPr>
-    </w:p>
-    <w:p>
-      <w:pPr>
-        <w:rPr>
-          <w:rtl/>
-        </w:rPr>
-      </w:pPr>
-    </w:p>
-    <w:p>
-      <w:pPr>
-        <w:rPr>
-          <w:rtl/>
-        </w:rPr>
-      </w:pPr>
-    </w:p>
-    <w:p>
-      <w:pPr>
-        <w:rPr>
-          <w:rtl/>
-        </w:rPr>
-      </w:pPr>
-    </w:p>
-    <w:p>
-      <w:pPr>
-        <w:rPr>
-          <w:rtl/>
-        </w:rPr>
-      </w:pPr>
-    </w:p>
-    <w:p>
-      <w:pPr>
         <w:bidi/>
         <w:rPr>
           <w:b/>
           <w:bCs/>
-        </w:rPr>
-      </w:pPr>
-      <w:r>
-        <w:rPr>
-          <w:b/>
-          <w:bCs/>
+          <w:sz w:val="32"/>
+          <w:szCs w:val="32"/>
+          <w:u w:val="single"/>
+        </w:rPr>
+      </w:pPr>
+      <w:r>
+        <w:rPr>
+          <w:b/>
+          <w:bCs/>
+          <w:sz w:val="32"/>
+          <w:szCs w:val="32"/>
+          <w:u w:val="single"/>
           <w:rtl/>
         </w:rPr>
         <w:lastRenderedPageBreak/>
@@ -2183,6 +2502,9 @@
         <w:rPr>
           <w:b/>
           <w:bCs/>
+          <w:sz w:val="32"/>
+          <w:szCs w:val="32"/>
+          <w:u w:val="single"/>
         </w:rPr>
         <w:t xml:space="preserve"> (Security, Error Handling &amp; Validation)</w:t>
       </w:r>
@@ -2681,6 +3003,42 @@
     </w:p>
     <w:p>
       <w:pPr>
+        <w:numPr>
+          <w:ilvl w:val="0"/>
+          <w:numId w:val="14"/>
+        </w:numPr>
+        <w:bidi/>
+      </w:pPr>
+      <w:r>
+        <w:rPr>
+          <w:b/>
+          <w:bCs/>
+          <w:rtl/>
+        </w:rPr>
+        <w:t>הגבלת יצירת קבוצות</w:t>
+      </w:r>
+      <w:r>
+        <w:rPr>
+          <w:b/>
+          <w:bCs/>
+        </w:rPr>
+        <w:t xml:space="preserve"> (Quota Limits):</w:t>
+      </w:r>
+      <w:r>
+        <w:t xml:space="preserve"> </w:t>
+      </w:r>
+      <w:r>
+        <w:rPr>
+          <w:rtl/>
+        </w:rPr>
+        <w:t>בעת קריאה לנתיב יצירת קבוצה, השרת יוודא מול מסד הנתונים שהמשתמש אינו מנהל כבר 5 קבוצות פעילות. ניסיון ליצור קבוצה שישית יידחה עם שגיאה מתאימה</w:t>
+      </w:r>
+      <w:r>
+        <w:t>.</w:t>
+      </w:r>
+    </w:p>
+    <w:p>
+      <w:pPr>
         <w:bidi/>
       </w:pPr>
       <w:r>
@@ -2770,6 +3128,7 @@
           <w:bCs/>
           <w:rtl/>
         </w:rPr>
+        <w:lastRenderedPageBreak/>
         <w:t>הגבלת</w:t>
       </w:r>
       <w:r>
@@ -2934,7 +3293,6 @@
           <w:bCs/>
           <w:rtl/>
         </w:rPr>
-        <w:lastRenderedPageBreak/>
         <w:t>מבנה שגיאות אחיד ולוגים בשרת</w:t>
       </w:r>
       <w:r>
@@ -3126,57 +3484,21 @@
     <w:p>
       <w:pPr>
         <w:bidi/>
-      </w:pPr>
-    </w:p>
-    <w:p>
-      <w:pPr>
-        <w:bidi/>
-      </w:pPr>
-    </w:p>
-    <w:p>
-      <w:pPr>
-        <w:bidi/>
-      </w:pPr>
-    </w:p>
-    <w:p>
-      <w:pPr>
-        <w:bidi/>
-      </w:pPr>
-    </w:p>
-    <w:p>
-      <w:pPr>
-        <w:bidi/>
-        <w:rPr>
-          <w:rtl/>
-        </w:rPr>
-      </w:pPr>
-    </w:p>
-    <w:p>
-      <w:pPr>
-        <w:rPr>
-          <w:rtl/>
-        </w:rPr>
-      </w:pPr>
-    </w:p>
-    <w:p>
-      <w:pPr>
-        <w:rPr>
-          <w:rtl/>
-        </w:rPr>
-      </w:pPr>
-    </w:p>
-    <w:p>
-      <w:pPr>
-        <w:bidi/>
-        <w:rPr>
-          <w:b/>
-          <w:bCs/>
-        </w:rPr>
-      </w:pPr>
-      <w:r>
-        <w:rPr>
-          <w:b/>
-          <w:bCs/>
+        <w:rPr>
+          <w:b/>
+          <w:bCs/>
+          <w:sz w:val="32"/>
+          <w:szCs w:val="32"/>
+          <w:u w:val="single"/>
+        </w:rPr>
+      </w:pPr>
+      <w:r>
+        <w:rPr>
+          <w:b/>
+          <w:bCs/>
+          <w:sz w:val="32"/>
+          <w:szCs w:val="32"/>
+          <w:u w:val="single"/>
           <w:rtl/>
         </w:rPr>
         <w:lastRenderedPageBreak/>
@@ -3186,6 +3508,9 @@
         <w:rPr>
           <w:b/>
           <w:bCs/>
+          <w:sz w:val="32"/>
+          <w:szCs w:val="32"/>
+          <w:u w:val="single"/>
         </w:rPr>
         <w:t xml:space="preserve"> (REST API Endpoints)</w:t>
       </w:r>
@@ -5183,6 +5508,7 @@
                 <w:rtl/>
                 <w14:ligatures w14:val="none"/>
               </w:rPr>
+              <w:lastRenderedPageBreak/>
               <w:t>מיקום</w:t>
             </w:r>
           </w:p>
@@ -5363,7 +5689,6 @@
                 <w:rtl/>
                 <w14:ligatures w14:val="none"/>
               </w:rPr>
-              <w:lastRenderedPageBreak/>
               <w:t>חסימות</w:t>
             </w:r>
           </w:p>
@@ -6936,6 +7261,341 @@
       </w:tr>
       <w:tr>
         <w:trPr>
+          <w:trHeight w:val="402"/>
+        </w:trPr>
+        <w:tc>
+          <w:tcPr>
+            <w:tcW w:w="1273" w:type="dxa"/>
+            <w:tcBorders>
+              <w:top w:val="nil"/>
+              <w:left w:val="single" w:sz="8" w:space="0" w:color="C4C7C5"/>
+              <w:bottom w:val="single" w:sz="8" w:space="0" w:color="C4C7C5"/>
+              <w:right w:val="single" w:sz="8" w:space="0" w:color="C4C7C5"/>
+            </w:tcBorders>
+            <w:vAlign w:val="center"/>
+          </w:tcPr>
+          <w:p>
+            <w:pPr>
+              <w:bidi/>
+              <w:spacing w:after="0" w:line="240" w:lineRule="auto"/>
+              <w:rPr>
+                <w:rFonts w:ascii="Arial" w:eastAsia="Times New Roman" w:hAnsi="Arial" w:cs="Arial"/>
+                <w:b/>
+                <w:bCs/>
+                <w:color w:val="1F1F1F"/>
+                <w:kern w:val="0"/>
+                <w:rtl/>
+                <w14:ligatures w14:val="none"/>
+              </w:rPr>
+            </w:pPr>
+            <w:r>
+              <w:rPr>
+                <w:rFonts w:ascii="Arial" w:eastAsia="Times New Roman" w:hAnsi="Arial" w:cs="Arial"/>
+                <w:b/>
+                <w:bCs/>
+                <w:color w:val="1F1F1F"/>
+                <w:kern w:val="0"/>
+                <w:rtl/>
+                <w14:ligatures w14:val="none"/>
+              </w:rPr>
+              <w:t>קבוצות</w:t>
+            </w:r>
+          </w:p>
+        </w:tc>
+        <w:tc>
+          <w:tcPr>
+            <w:tcW w:w="1134" w:type="dxa"/>
+            <w:tcBorders>
+              <w:top w:val="nil"/>
+              <w:left w:val="single" w:sz="8" w:space="0" w:color="C4C7C5"/>
+              <w:bottom w:val="single" w:sz="8" w:space="0" w:color="C4C7C5"/>
+              <w:right w:val="single" w:sz="8" w:space="0" w:color="C4C7C5"/>
+            </w:tcBorders>
+            <w:vAlign w:val="center"/>
+          </w:tcPr>
+          <w:p>
+            <w:pPr>
+              <w:bidi/>
+              <w:spacing w:after="0" w:line="240" w:lineRule="auto"/>
+              <w:rPr>
+                <w:rFonts w:ascii="Arial" w:eastAsia="Times New Roman" w:hAnsi="Arial" w:cs="Arial"/>
+                <w:color w:val="1F1F1F"/>
+                <w:kern w:val="0"/>
+                <w14:ligatures w14:val="none"/>
+              </w:rPr>
+            </w:pPr>
+            <w:r>
+              <w:rPr>
+                <w:rFonts w:ascii="Arial" w:eastAsia="Times New Roman" w:hAnsi="Arial" w:cs="Arial"/>
+                <w:color w:val="1F1F1F"/>
+                <w:kern w:val="0"/>
+                <w14:ligatures w14:val="none"/>
+              </w:rPr>
+              <w:t>POST</w:t>
+            </w:r>
+          </w:p>
+        </w:tc>
+        <w:tc>
+          <w:tcPr>
+            <w:tcW w:w="3118" w:type="dxa"/>
+            <w:tcBorders>
+              <w:top w:val="nil"/>
+              <w:left w:val="single" w:sz="8" w:space="0" w:color="C4C7C5"/>
+              <w:bottom w:val="single" w:sz="8" w:space="0" w:color="C4C7C5"/>
+              <w:right w:val="single" w:sz="8" w:space="0" w:color="C4C7C5"/>
+            </w:tcBorders>
+            <w:vAlign w:val="center"/>
+          </w:tcPr>
+          <w:p>
+            <w:pPr>
+              <w:bidi/>
+              <w:spacing w:after="0" w:line="240" w:lineRule="auto"/>
+              <w:rPr>
+                <w:rFonts w:ascii="Arial" w:eastAsia="Times New Roman" w:hAnsi="Arial" w:cs="Arial"/>
+                <w:color w:val="1F1F1F"/>
+                <w:kern w:val="0"/>
+                <w:rtl/>
+                <w14:ligatures w14:val="none"/>
+              </w:rPr>
+            </w:pPr>
+            <w:r>
+              <w:rPr>
+                <w:rFonts w:ascii="Arial" w:eastAsia="Times New Roman" w:hAnsi="Arial" w:cs="Arial"/>
+                <w:color w:val="1F1F1F"/>
+                <w:kern w:val="0"/>
+                <w14:ligatures w14:val="none"/>
+              </w:rPr>
+              <w:t>/</w:t>
+            </w:r>
+            <w:proofErr w:type="spellStart"/>
+            <w:r>
+              <w:rPr>
+                <w:rFonts w:ascii="Arial" w:eastAsia="Times New Roman" w:hAnsi="Arial" w:cs="Arial"/>
+                <w:color w:val="1F1F1F"/>
+                <w:kern w:val="0"/>
+                <w14:ligatures w14:val="none"/>
+              </w:rPr>
+              <w:t>api</w:t>
+            </w:r>
+            <w:proofErr w:type="spellEnd"/>
+            <w:r>
+              <w:rPr>
+                <w:rFonts w:ascii="Arial" w:eastAsia="Times New Roman" w:hAnsi="Arial" w:cs="Arial"/>
+                <w:color w:val="1F1F1F"/>
+                <w:kern w:val="0"/>
+                <w14:ligatures w14:val="none"/>
+              </w:rPr>
+              <w:t>/v1/groups/:id/invite</w:t>
+            </w:r>
+          </w:p>
+        </w:tc>
+        <w:tc>
+          <w:tcPr>
+            <w:tcW w:w="3815" w:type="dxa"/>
+            <w:tcBorders>
+              <w:top w:val="nil"/>
+              <w:left w:val="single" w:sz="8" w:space="0" w:color="C4C7C5"/>
+              <w:bottom w:val="single" w:sz="8" w:space="0" w:color="C4C7C5"/>
+              <w:right w:val="single" w:sz="8" w:space="0" w:color="C4C7C5"/>
+            </w:tcBorders>
+            <w:vAlign w:val="center"/>
+          </w:tcPr>
+          <w:p>
+            <w:pPr>
+              <w:bidi/>
+              <w:spacing w:after="0" w:line="240" w:lineRule="auto"/>
+              <w:rPr>
+                <w:rFonts w:ascii="Arial" w:eastAsia="Times New Roman" w:hAnsi="Arial" w:cs="Arial"/>
+                <w:color w:val="1F1F1F"/>
+                <w:kern w:val="0"/>
+                <w:rtl/>
+                <w14:ligatures w14:val="none"/>
+              </w:rPr>
+            </w:pPr>
+            <w:r>
+              <w:rPr>
+                <w:rFonts w:ascii="Arial" w:eastAsia="Times New Roman" w:hAnsi="Arial" w:cs="Arial"/>
+                <w:color w:val="1F1F1F"/>
+                <w:kern w:val="0"/>
+                <w:rtl/>
+                <w14:ligatures w14:val="none"/>
+              </w:rPr>
+              <w:t>שליחת הזמנה למשתמש אחר להצטרף לקבוצה</w:t>
+            </w:r>
+          </w:p>
+        </w:tc>
+      </w:tr>
+      <w:tr>
+        <w:trPr>
+          <w:trHeight w:val="402"/>
+        </w:trPr>
+        <w:tc>
+          <w:tcPr>
+            <w:tcW w:w="1273" w:type="dxa"/>
+            <w:tcBorders>
+              <w:top w:val="nil"/>
+              <w:left w:val="single" w:sz="8" w:space="0" w:color="C4C7C5"/>
+              <w:bottom w:val="single" w:sz="8" w:space="0" w:color="C4C7C5"/>
+              <w:right w:val="single" w:sz="8" w:space="0" w:color="C4C7C5"/>
+            </w:tcBorders>
+            <w:vAlign w:val="center"/>
+          </w:tcPr>
+          <w:p>
+            <w:pPr>
+              <w:bidi/>
+              <w:spacing w:after="0" w:line="240" w:lineRule="auto"/>
+              <w:rPr>
+                <w:rFonts w:ascii="Arial" w:eastAsia="Times New Roman" w:hAnsi="Arial" w:cs="Arial"/>
+                <w:b/>
+                <w:bCs/>
+                <w:color w:val="1F1F1F"/>
+                <w:kern w:val="0"/>
+                <w:rtl/>
+                <w14:ligatures w14:val="none"/>
+              </w:rPr>
+            </w:pPr>
+            <w:r>
+              <w:rPr>
+                <w:rFonts w:ascii="Arial" w:eastAsia="Times New Roman" w:hAnsi="Arial" w:cs="Arial"/>
+                <w:b/>
+                <w:bCs/>
+                <w:color w:val="1F1F1F"/>
+                <w:kern w:val="0"/>
+                <w:rtl/>
+                <w14:ligatures w14:val="none"/>
+              </w:rPr>
+              <w:t>קבוצות</w:t>
+            </w:r>
+          </w:p>
+        </w:tc>
+        <w:tc>
+          <w:tcPr>
+            <w:tcW w:w="1134" w:type="dxa"/>
+            <w:tcBorders>
+              <w:top w:val="nil"/>
+              <w:left w:val="single" w:sz="8" w:space="0" w:color="C4C7C5"/>
+              <w:bottom w:val="single" w:sz="8" w:space="0" w:color="C4C7C5"/>
+              <w:right w:val="single" w:sz="8" w:space="0" w:color="C4C7C5"/>
+            </w:tcBorders>
+            <w:vAlign w:val="center"/>
+          </w:tcPr>
+          <w:p>
+            <w:pPr>
+              <w:bidi/>
+              <w:spacing w:after="0" w:line="240" w:lineRule="auto"/>
+              <w:rPr>
+                <w:rFonts w:ascii="Arial" w:eastAsia="Times New Roman" w:hAnsi="Arial" w:cs="Arial"/>
+                <w:color w:val="1F1F1F"/>
+                <w:kern w:val="0"/>
+                <w:rtl/>
+                <w:lang w:val="en-US"/>
+                <w14:ligatures w14:val="none"/>
+              </w:rPr>
+            </w:pPr>
+            <w:r>
+              <w:rPr>
+                <w:rFonts w:ascii="Arial" w:eastAsia="Times New Roman" w:hAnsi="Arial" w:cs="Arial"/>
+                <w:color w:val="1F1F1F"/>
+                <w:kern w:val="0"/>
+                <w:lang w:val="en-US"/>
+                <w14:ligatures w14:val="none"/>
+              </w:rPr>
+              <w:t>PUT</w:t>
+            </w:r>
+          </w:p>
+        </w:tc>
+        <w:tc>
+          <w:tcPr>
+            <w:tcW w:w="3118" w:type="dxa"/>
+            <w:tcBorders>
+              <w:top w:val="nil"/>
+              <w:left w:val="single" w:sz="8" w:space="0" w:color="C4C7C5"/>
+              <w:bottom w:val="single" w:sz="8" w:space="0" w:color="C4C7C5"/>
+              <w:right w:val="single" w:sz="8" w:space="0" w:color="C4C7C5"/>
+            </w:tcBorders>
+            <w:vAlign w:val="center"/>
+          </w:tcPr>
+          <w:p>
+            <w:pPr>
+              <w:bidi/>
+              <w:spacing w:after="0" w:line="240" w:lineRule="auto"/>
+              <w:rPr>
+                <w:rFonts w:ascii="Arial" w:eastAsia="Times New Roman" w:hAnsi="Arial" w:cs="Arial"/>
+                <w:color w:val="1F1F1F"/>
+                <w:kern w:val="0"/>
+                <w:rtl/>
+                <w14:ligatures w14:val="none"/>
+              </w:rPr>
+            </w:pPr>
+            <w:r>
+              <w:rPr>
+                <w:rFonts w:ascii="Arial" w:eastAsia="Times New Roman" w:hAnsi="Arial" w:cs="Arial"/>
+                <w:color w:val="1F1F1F"/>
+                <w:kern w:val="0"/>
+                <w14:ligatures w14:val="none"/>
+              </w:rPr>
+              <w:t>/</w:t>
+            </w:r>
+            <w:proofErr w:type="spellStart"/>
+            <w:r>
+              <w:rPr>
+                <w:rFonts w:ascii="Arial" w:eastAsia="Times New Roman" w:hAnsi="Arial" w:cs="Arial"/>
+                <w:color w:val="1F1F1F"/>
+                <w:kern w:val="0"/>
+                <w14:ligatures w14:val="none"/>
+              </w:rPr>
+              <w:t>api</w:t>
+            </w:r>
+            <w:proofErr w:type="spellEnd"/>
+            <w:r>
+              <w:rPr>
+                <w:rFonts w:ascii="Arial" w:eastAsia="Times New Roman" w:hAnsi="Arial" w:cs="Arial"/>
+                <w:color w:val="1F1F1F"/>
+                <w:kern w:val="0"/>
+                <w14:ligatures w14:val="none"/>
+              </w:rPr>
+              <w:t>/v1/users/invitations/:id/respond</w:t>
+            </w:r>
+          </w:p>
+        </w:tc>
+        <w:tc>
+          <w:tcPr>
+            <w:tcW w:w="3815" w:type="dxa"/>
+            <w:tcBorders>
+              <w:top w:val="nil"/>
+              <w:left w:val="single" w:sz="8" w:space="0" w:color="C4C7C5"/>
+              <w:bottom w:val="single" w:sz="8" w:space="0" w:color="C4C7C5"/>
+              <w:right w:val="single" w:sz="8" w:space="0" w:color="C4C7C5"/>
+            </w:tcBorders>
+            <w:vAlign w:val="center"/>
+          </w:tcPr>
+          <w:p>
+            <w:pPr>
+              <w:bidi/>
+              <w:spacing w:after="0" w:line="240" w:lineRule="auto"/>
+              <w:rPr>
+                <w:rFonts w:ascii="Arial" w:eastAsia="Times New Roman" w:hAnsi="Arial" w:cs="Arial"/>
+                <w:color w:val="1F1F1F"/>
+                <w:kern w:val="0"/>
+                <w:rtl/>
+                <w14:ligatures w14:val="none"/>
+              </w:rPr>
+            </w:pPr>
+            <w:r>
+              <w:rPr>
+                <w:rFonts w:ascii="Arial" w:eastAsia="Times New Roman" w:hAnsi="Arial" w:cs="Arial"/>
+                <w:color w:val="1F1F1F"/>
+                <w:kern w:val="0"/>
+                <w:rtl/>
+                <w14:ligatures w14:val="none"/>
+              </w:rPr>
+              <w:t>אישור או דחייה של הזמנה קיימת</w:t>
+            </w:r>
+          </w:p>
+        </w:tc>
+      </w:tr>
+      <w:tr>
+        <w:trPr>
           <w:trHeight w:val="692"/>
         </w:trPr>
         <w:tc>
@@ -8139,6 +8799,7 @@
                 <w:rtl/>
                 <w14:ligatures w14:val="none"/>
               </w:rPr>
+              <w:lastRenderedPageBreak/>
               <w:t>תגובות</w:t>
             </w:r>
           </w:p>
@@ -8480,7 +9141,6 @@
                 <w:rtl/>
                 <w14:ligatures w14:val="none"/>
               </w:rPr>
-              <w:lastRenderedPageBreak/>
               <w:t>צ'אט</w:t>
             </w:r>
           </w:p>
@@ -9094,45 +9754,22 @@
     </w:p>
     <w:p>
       <w:pPr>
-        <w:rPr>
-          <w:rtl/>
-        </w:rPr>
-      </w:pPr>
-    </w:p>
-    <w:p>
-      <w:pPr>
-        <w:rPr>
-          <w:rtl/>
-        </w:rPr>
-      </w:pPr>
-    </w:p>
-    <w:p>
-      <w:pPr>
-        <w:rPr>
-          <w:rtl/>
-        </w:rPr>
-      </w:pPr>
-    </w:p>
-    <w:p>
-      <w:pPr>
-        <w:rPr>
-          <w:rtl/>
-        </w:rPr>
-      </w:pPr>
-    </w:p>
-    <w:p>
-      <w:pPr>
         <w:bidi/>
         <w:rPr>
           <w:b/>
           <w:bCs/>
-          <w:lang/>
-        </w:rPr>
-      </w:pPr>
-      <w:r>
-        <w:rPr>
-          <w:b/>
-          <w:bCs/>
+          <w:sz w:val="32"/>
+          <w:szCs w:val="32"/>
+          <w:u w:val="single"/>
+        </w:rPr>
+      </w:pPr>
+      <w:r>
+        <w:rPr>
+          <w:b/>
+          <w:bCs/>
+          <w:sz w:val="32"/>
+          <w:szCs w:val="32"/>
+          <w:u w:val="single"/>
           <w:rtl/>
         </w:rPr>
         <w:lastRenderedPageBreak/>
@@ -9142,7 +9779,9 @@
         <w:rPr>
           <w:b/>
           <w:bCs/>
-          <w:lang/>
+          <w:sz w:val="32"/>
+          <w:szCs w:val="32"/>
+          <w:u w:val="single"/>
         </w:rPr>
         <w:t xml:space="preserve"> (Real-Time &amp; Background Jobs)</w:t>
       </w:r>
@@ -9150,9 +9789,6 @@
     <w:p>
       <w:pPr>
         <w:bidi/>
-        <w:rPr>
-          <w:lang/>
-        </w:rPr>
       </w:pPr>
       <w:r>
         <w:rPr>
@@ -9166,7 +9802,6 @@
         <w:rPr>
           <w:b/>
           <w:bCs/>
-          <w:lang/>
         </w:rPr>
         <w:t xml:space="preserve"> (WebSockets </w:t>
       </w:r>
@@ -9182,14 +9817,10 @@
         <w:rPr>
           <w:b/>
           <w:bCs/>
-          <w:lang/>
         </w:rPr>
         <w:t xml:space="preserve"> Socket.io)</w:t>
       </w:r>
       <w:r>
-        <w:rPr>
-          <w:lang/>
-        </w:rPr>
         <w:t xml:space="preserve"> </w:t>
       </w:r>
       <w:r>
@@ -9199,9 +9830,6 @@
         <w:t>הצ'אט הפרטי באפליקציה דורש תקשורת דו כיוונית פתוחה ורציפה. במקום שאפליקציית הלקוח תבצע שאילתות חוזרות ונשנות לשרת</w:t>
       </w:r>
       <w:r>
-        <w:rPr>
-          <w:lang/>
-        </w:rPr>
         <w:t xml:space="preserve"> (Polling), </w:t>
       </w:r>
       <w:r>
@@ -9211,9 +9839,6 @@
         <w:t>השרת ידחוף את ההודעות ישירות למכשיר הקצה ברגע הגעתן</w:t>
       </w:r>
       <w:r>
-        <w:rPr>
-          <w:lang/>
-        </w:rPr>
         <w:t>.</w:t>
       </w:r>
     </w:p>
@@ -9224,9 +9849,6 @@
           <w:numId w:val="18"/>
         </w:numPr>
         <w:bidi/>
-        <w:rPr>
-          <w:lang/>
-        </w:rPr>
       </w:pPr>
       <w:r>
         <w:rPr>
@@ -9240,14 +9862,10 @@
         <w:rPr>
           <w:b/>
           <w:bCs/>
-          <w:lang/>
         </w:rPr>
         <w:t xml:space="preserve"> (Socket Authentication):</w:t>
       </w:r>
       <w:r>
-        <w:rPr>
-          <w:lang/>
-        </w:rPr>
         <w:t xml:space="preserve"> </w:t>
       </w:r>
       <w:r>
@@ -9257,9 +9875,6 @@
         <w:t>בעת פתיחת חיבור ה</w:t>
       </w:r>
       <w:r>
-        <w:rPr>
-          <w:lang/>
-        </w:rPr>
         <w:t xml:space="preserve">-WebSockets, </w:t>
       </w:r>
       <w:r>
@@ -9269,9 +9884,6 @@
         <w:t>אפליקציית ה</w:t>
       </w:r>
       <w:r>
-        <w:rPr>
-          <w:lang/>
-        </w:rPr>
         <w:t xml:space="preserve">-Flutter </w:t>
       </w:r>
       <w:r>
@@ -9281,9 +9893,6 @@
         <w:t>תשלח את טוקן האימות של</w:t>
       </w:r>
       <w:r>
-        <w:rPr>
-          <w:lang/>
-        </w:rPr>
         <w:t xml:space="preserve"> Firebase (JWT). </w:t>
       </w:r>
       <w:r>
@@ -9293,9 +9902,6 @@
         <w:t>השרת יאמת אותו וישייך את צינור התקשורת למזהה המשתמש הספציפי במסד הנתונים</w:t>
       </w:r>
       <w:r>
-        <w:rPr>
-          <w:lang/>
-        </w:rPr>
         <w:t>.</w:t>
       </w:r>
     </w:p>
@@ -9306,9 +9912,6 @@
           <w:numId w:val="18"/>
         </w:numPr>
         <w:bidi/>
-        <w:rPr>
-          <w:lang/>
-        </w:rPr>
       </w:pPr>
       <w:r>
         <w:rPr>
@@ -9322,7 +9925,6 @@
         <w:rPr>
           <w:b/>
           <w:bCs/>
-          <w:lang/>
         </w:rPr>
         <w:t xml:space="preserve"> (Heartbeat </w:t>
       </w:r>
@@ -9338,14 +9940,10 @@
         <w:rPr>
           <w:b/>
           <w:bCs/>
-          <w:lang/>
         </w:rPr>
         <w:t xml:space="preserve"> Ping-Pong):</w:t>
       </w:r>
       <w:r>
-        <w:rPr>
-          <w:lang/>
-        </w:rPr>
         <w:t xml:space="preserve"> </w:t>
       </w:r>
       <w:r>
@@ -9355,9 +9953,6 @@
         <w:t>השרת והאפליקציה יחליפו ביניהם אותות קצרים</w:t>
       </w:r>
       <w:r>
-        <w:rPr>
-          <w:lang/>
-        </w:rPr>
         <w:t xml:space="preserve"> (Ping/Pong) </w:t>
       </w:r>
       <w:r>
@@ -9367,9 +9962,6 @@
         <w:t>באופן אוטומטי בכל כמה שניות. מנגנון זה חיוני כדי לזהות "חיבורי רפאים", מצבים שבהם הטלפון מציג חיווי כאילו הוא מחובר לרשת אך בפועל החיבור נקטע. ברגע שפעימת לב מחטיאה, האפליקציה מבינה מיד שהיא מנותקת</w:t>
       </w:r>
       <w:r>
-        <w:rPr>
-          <w:lang/>
-        </w:rPr>
         <w:t>.</w:t>
       </w:r>
     </w:p>
@@ -9380,9 +9972,6 @@
           <w:numId w:val="18"/>
         </w:numPr>
         <w:bidi/>
-        <w:rPr>
-          <w:lang/>
-        </w:rPr>
       </w:pPr>
       <w:r>
         <w:rPr>
@@ -9396,14 +9985,10 @@
         <w:rPr>
           <w:b/>
           <w:bCs/>
-          <w:lang/>
         </w:rPr>
         <w:t xml:space="preserve"> (Message Acknowledgments):</w:t>
       </w:r>
       <w:r>
-        <w:rPr>
-          <w:lang/>
-        </w:rPr>
         <w:t xml:space="preserve"> </w:t>
       </w:r>
       <w:r>
@@ -9413,9 +9998,6 @@
         <w:t>כאשר משתמש שולח הודעה בצ'אט, האפליקציה לא תניח שהיא הגיעה ליעדה באופן אוטומטי. השרת מחויב להחזיר אישור דיגיטלי</w:t>
       </w:r>
       <w:r>
-        <w:rPr>
-          <w:lang/>
-        </w:rPr>
         <w:t xml:space="preserve"> (ACK) </w:t>
       </w:r>
       <w:r>
@@ -9425,9 +10007,6 @@
         <w:t>ללקוח ברגע שההודעה נרשמה בהצלחה במסד הנתונים. אם אישור זה לא מתקבל תוך זמן קצוב</w:t>
       </w:r>
       <w:r>
-        <w:rPr>
-          <w:lang/>
-        </w:rPr>
         <w:t xml:space="preserve"> (Timeout), </w:t>
       </w:r>
       <w:r>
@@ -9437,9 +10016,6 @@
         <w:t>האפליקציה תדע שהשליחה נכשלה</w:t>
       </w:r>
       <w:r>
-        <w:rPr>
-          <w:lang/>
-        </w:rPr>
         <w:t>.</w:t>
       </w:r>
     </w:p>
@@ -9450,9 +10026,6 @@
           <w:numId w:val="18"/>
         </w:numPr>
         <w:bidi/>
-        <w:rPr>
-          <w:lang/>
-        </w:rPr>
       </w:pPr>
       <w:r>
         <w:rPr>
@@ -9466,14 +10039,10 @@
         <w:rPr>
           <w:b/>
           <w:bCs/>
-          <w:lang/>
         </w:rPr>
         <w:t xml:space="preserve"> (Socket Events):</w:t>
       </w:r>
       <w:r>
-        <w:rPr>
-          <w:lang/>
-        </w:rPr>
         <w:t xml:space="preserve"> </w:t>
       </w:r>
       <w:r>
@@ -9483,9 +10052,6 @@
         <w:t>מערכת אירועים ממוקדת עבור ה</w:t>
       </w:r>
       <w:r>
-        <w:rPr>
-          <w:lang/>
-        </w:rPr>
         <w:t>-MVP:</w:t>
       </w:r>
     </w:p>
@@ -9496,14 +10062,8 @@
           <w:numId w:val="18"/>
         </w:numPr>
         <w:bidi/>
-        <w:rPr>
-          <w:lang/>
-        </w:rPr>
-      </w:pPr>
-      <w:r>
-        <w:rPr>
-          <w:lang/>
-        </w:rPr>
+      </w:pPr>
+      <w:r>
         <w:t xml:space="preserve">join_chat: </w:t>
       </w:r>
       <w:r>
@@ -9513,9 +10073,6 @@
         <w:t>הצטרפות לחדר שיחה ספציפי</w:t>
       </w:r>
       <w:r>
-        <w:rPr>
-          <w:lang/>
-        </w:rPr>
         <w:t xml:space="preserve"> (</w:t>
       </w:r>
       <w:r>
@@ -9525,9 +10082,6 @@
         <w:t>לפי מזהה</w:t>
       </w:r>
       <w:r>
-        <w:rPr>
-          <w:lang/>
-        </w:rPr>
         <w:t xml:space="preserve"> Conversation) </w:t>
       </w:r>
       <w:r>
@@ -9537,9 +10091,6 @@
         <w:t>כדי להאזין להודעות</w:t>
       </w:r>
       <w:r>
-        <w:rPr>
-          <w:lang/>
-        </w:rPr>
         <w:t>.</w:t>
       </w:r>
     </w:p>
@@ -9550,14 +10101,8 @@
           <w:numId w:val="18"/>
         </w:numPr>
         <w:bidi/>
-        <w:rPr>
-          <w:lang/>
-        </w:rPr>
-      </w:pPr>
-      <w:r>
-        <w:rPr>
-          <w:lang/>
-        </w:rPr>
+      </w:pPr>
+      <w:r>
         <w:t xml:space="preserve">send_message: </w:t>
       </w:r>
       <w:r>
@@ -9567,9 +10112,6 @@
         <w:t>שידור הודעה חדשה לשרת (כאן תיאכף הגבלת ה-2 שניות כדי למנוע ספאם)</w:t>
       </w:r>
       <w:r>
-        <w:rPr>
-          <w:lang/>
-        </w:rPr>
         <w:t>.</w:t>
       </w:r>
     </w:p>
@@ -9580,14 +10122,8 @@
           <w:numId w:val="18"/>
         </w:numPr>
         <w:bidi/>
-        <w:rPr>
-          <w:lang/>
-        </w:rPr>
-      </w:pPr>
-      <w:r>
-        <w:rPr>
-          <w:lang/>
-        </w:rPr>
+      </w:pPr>
+      <w:r>
         <w:t xml:space="preserve">receive_message: </w:t>
       </w:r>
       <w:r>
@@ -9597,9 +10133,6 @@
         <w:t>קבלת הודעה חדשה בצד הלקוח והצגתה בתוך מסך הצ'אט הפתוח</w:t>
       </w:r>
       <w:r>
-        <w:rPr>
-          <w:lang/>
-        </w:rPr>
         <w:t>.</w:t>
       </w:r>
     </w:p>
@@ -9610,14 +10143,8 @@
           <w:numId w:val="18"/>
         </w:numPr>
         <w:bidi/>
-        <w:rPr>
-          <w:lang/>
-        </w:rPr>
-      </w:pPr>
-      <w:r>
-        <w:rPr>
-          <w:lang/>
-        </w:rPr>
+      </w:pPr>
+      <w:r>
         <w:t xml:space="preserve">global_badge_update: </w:t>
       </w:r>
       <w:r>
@@ -9627,9 +10154,6 @@
         <w:t>אירוע רקע כללי הנשלח למשתמש כאשר הוא נמצא במקום אחר באפליקציה (לדוגמה גולש בפיד), ומעדכן באופן מיידי את מוני ההתראות והבאדג'ים בתפריט הניווט</w:t>
       </w:r>
       <w:r>
-        <w:rPr>
-          <w:lang/>
-        </w:rPr>
         <w:t>.</w:t>
       </w:r>
     </w:p>
@@ -9640,14 +10164,8 @@
           <w:numId w:val="18"/>
         </w:numPr>
         <w:bidi/>
-        <w:rPr>
-          <w:lang/>
-        </w:rPr>
-      </w:pPr>
-      <w:r>
-        <w:rPr>
-          <w:lang/>
-        </w:rPr>
+      </w:pPr>
+      <w:r>
         <w:t xml:space="preserve">typing: </w:t>
       </w:r>
       <w:r>
@@ -9657,9 +10175,6 @@
         <w:t>הפעלת חיווי ויזואלי של "מקליד..." שמועבר לצד השני ונכבה אוטומטית כעבור 3 שניות</w:t>
       </w:r>
       <w:r>
-        <w:rPr>
-          <w:lang/>
-        </w:rPr>
         <w:t>.</w:t>
       </w:r>
     </w:p>
@@ -9670,9 +10185,6 @@
           <w:numId w:val="18"/>
         </w:numPr>
         <w:bidi/>
-        <w:rPr>
-          <w:lang/>
-        </w:rPr>
       </w:pPr>
       <w:r>
         <w:rPr>
@@ -9686,14 +10198,10 @@
         <w:rPr>
           <w:b/>
           <w:bCs/>
-          <w:lang/>
         </w:rPr>
         <w:t xml:space="preserve"> (UI Error Handling):</w:t>
       </w:r>
       <w:r>
-        <w:rPr>
-          <w:lang/>
-        </w:rPr>
         <w:t xml:space="preserve"> </w:t>
       </w:r>
       <w:r>
@@ -9703,9 +10211,6 @@
         <w:t>בכל מקרה שבו מנגנון פעימות הלב מזהה ניתוק, או שמנגנון אישור הקבלה</w:t>
       </w:r>
       <w:r>
-        <w:rPr>
-          <w:lang/>
-        </w:rPr>
         <w:t xml:space="preserve"> (ACK) </w:t>
       </w:r>
       <w:r>
@@ -9715,9 +10220,6 @@
         <w:t>מדווח על כשל בשליחת הודעה, האפליקציה תפעיל מנגנון חיבור מחדש אוטומטי</w:t>
       </w:r>
       <w:r>
-        <w:rPr>
-          <w:lang/>
-        </w:rPr>
         <w:t xml:space="preserve"> (Auto-Reconnect). </w:t>
       </w:r>
       <w:r>
@@ -9727,9 +10229,6 @@
         <w:t>במקביל, חובה להציג למשתמש חיווי ויזואלי ברור ומיידי על גבי ממשק המשתמש</w:t>
       </w:r>
       <w:r>
-        <w:rPr>
-          <w:lang/>
-        </w:rPr>
         <w:t xml:space="preserve"> (</w:t>
       </w:r>
       <w:r>
@@ -9783,9 +10282,6 @@
     <w:p>
       <w:pPr>
         <w:bidi/>
-        <w:rPr>
-          <w:lang/>
-        </w:rPr>
       </w:pPr>
       <w:r>
         <w:rPr>
@@ -9799,14 +10295,10 @@
         <w:rPr>
           <w:b/>
           <w:bCs/>
-          <w:lang/>
         </w:rPr>
         <w:t xml:space="preserve"> (RabbitMQ)</w:t>
       </w:r>
       <w:r>
-        <w:rPr>
-          <w:lang/>
-        </w:rPr>
         <w:t xml:space="preserve"> </w:t>
       </w:r>
       <w:r>
@@ -9816,9 +10308,6 @@
         <w:t>כדי ששרת ה</w:t>
       </w:r>
       <w:r>
-        <w:rPr>
-          <w:lang/>
-        </w:rPr>
         <w:t xml:space="preserve">-Node.js </w:t>
       </w:r>
       <w:r>
@@ -9828,9 +10317,6 @@
         <w:t>המרכזי יישאר פנוי לחלוטין ויגיב במהירות לכל בקשת</w:t>
       </w:r>
       <w:r>
-        <w:rPr>
-          <w:lang/>
-        </w:rPr>
         <w:t xml:space="preserve"> API, </w:t>
       </w:r>
       <w:r>
@@ -9840,9 +10326,6 @@
         <w:t>אנו נעביר משימות כבדות או תלויות בספקים חיצוניים לשרתי עבודה צדדיים</w:t>
       </w:r>
       <w:r>
-        <w:rPr>
-          <w:lang/>
-        </w:rPr>
         <w:t xml:space="preserve"> (Workers) </w:t>
       </w:r>
       <w:r>
@@ -9852,9 +10335,6 @@
         <w:t>באמצעות תורי הודעות אסינכרוניים</w:t>
       </w:r>
       <w:r>
-        <w:rPr>
-          <w:lang/>
-        </w:rPr>
         <w:t>.</w:t>
       </w:r>
     </w:p>
@@ -9865,9 +10345,6 @@
           <w:numId w:val="19"/>
         </w:numPr>
         <w:bidi/>
-        <w:rPr>
-          <w:lang/>
-        </w:rPr>
       </w:pPr>
       <w:r>
         <w:rPr>
@@ -9881,14 +10358,10 @@
         <w:rPr>
           <w:b/>
           <w:bCs/>
-          <w:lang/>
         </w:rPr>
         <w:t xml:space="preserve"> (AI Moderation Queue):</w:t>
       </w:r>
       <w:r>
-        <w:rPr>
-          <w:lang/>
-        </w:rPr>
         <w:t xml:space="preserve"> </w:t>
       </w:r>
       <w:r>
@@ -9898,9 +10371,6 @@
         <w:t>כאשר משתמש מפרסם פוסט או תגובה, הבקשה נכנסת מיד לתור ייעודי ב</w:t>
       </w:r>
       <w:r>
-        <w:rPr>
-          <w:lang/>
-        </w:rPr>
         <w:t xml:space="preserve">-RabbitMQ, </w:t>
       </w:r>
       <w:r>
@@ -9910,9 +10380,6 @@
         <w:t>ושרת ה</w:t>
       </w:r>
       <w:r>
-        <w:rPr>
-          <w:lang/>
-        </w:rPr>
         <w:t xml:space="preserve">-API </w:t>
       </w:r>
       <w:r>
@@ -9922,9 +10389,6 @@
         <w:t>מחזיר תגובה מהירה ללקוח שהתוכן התקבל. ברקע, שרת ה</w:t>
       </w:r>
       <w:r>
-        <w:rPr>
-          <w:lang/>
-        </w:rPr>
         <w:t xml:space="preserve">-Worker </w:t>
       </w:r>
       <w:r>
@@ -9934,9 +10398,6 @@
         <w:t>מושך את הטקסט ומנתח אותו מול מודל שפה מהיר</w:t>
       </w:r>
       <w:r>
-        <w:rPr>
-          <w:lang/>
-        </w:rPr>
         <w:t xml:space="preserve"> (</w:t>
       </w:r>
       <w:r>
@@ -9946,10 +10407,11 @@
         <w:t>כמו</w:t>
       </w:r>
       <w:r>
-        <w:rPr>
-          <w:lang/>
-        </w:rPr>
-        <w:t xml:space="preserve"> Gemini 1.5 Flash) </w:t>
+        <w:t xml:space="preserve"> Gemini 1.5 </w:t>
+      </w:r>
+      <w:r>
+        <w:lastRenderedPageBreak/>
+        <w:t xml:space="preserve">Flash) </w:t>
       </w:r>
       <w:r>
         <w:rPr>
@@ -9958,9 +10420,6 @@
         <w:t>לזיהוי קללות, הטרדות או בריונות. אם התוכן תקין, ה</w:t>
       </w:r>
       <w:r>
-        <w:rPr>
-          <w:lang/>
-        </w:rPr>
         <w:t xml:space="preserve">-Worker </w:t>
       </w:r>
       <w:r>
@@ -9970,9 +10429,6 @@
         <w:t>מעדכן את הסטטוס שלו במסד הנתונים והוא הופך לגלוי בפיד</w:t>
       </w:r>
       <w:r>
-        <w:rPr>
-          <w:lang/>
-        </w:rPr>
         <w:t>.</w:t>
       </w:r>
     </w:p>
@@ -9983,31 +10439,23 @@
           <w:numId w:val="19"/>
         </w:numPr>
         <w:bidi/>
-        <w:rPr>
-          <w:lang/>
-        </w:rPr>
-      </w:pPr>
-      <w:r>
-        <w:rPr>
-          <w:b/>
-          <w:bCs/>
-          <w:rtl/>
-        </w:rPr>
-        <w:lastRenderedPageBreak/>
+      </w:pPr>
+      <w:r>
+        <w:rPr>
+          <w:b/>
+          <w:bCs/>
+          <w:rtl/>
+        </w:rPr>
         <w:t>תור התראות דחיפה</w:t>
       </w:r>
       <w:r>
         <w:rPr>
           <w:b/>
           <w:bCs/>
-          <w:lang/>
         </w:rPr>
         <w:t xml:space="preserve"> (Push Notifications Queue):</w:t>
       </w:r>
       <w:r>
-        <w:rPr>
-          <w:lang/>
-        </w:rPr>
         <w:t xml:space="preserve"> </w:t>
       </w:r>
       <w:r>
@@ -10017,9 +10465,6 @@
         <w:t>שליחת התראות למערכות של גוגל</w:t>
       </w:r>
       <w:r>
-        <w:rPr>
-          <w:lang/>
-        </w:rPr>
         <w:t xml:space="preserve"> (FCM) </w:t>
       </w:r>
       <w:r>
@@ -10029,9 +10474,6 @@
         <w:t>ואפל</w:t>
       </w:r>
       <w:r>
-        <w:rPr>
-          <w:lang/>
-        </w:rPr>
         <w:t xml:space="preserve"> (APNs) </w:t>
       </w:r>
       <w:r>
@@ -10041,9 +10483,6 @@
         <w:t>עשויה לקחת זמן ותלויה ביציבות השרתים שלהן. לכן, כל אירוע שמייצר התראה (לייק, תגובה, הודעה בתיבת הלא-מאושרים) ייזרק לתור. שרתי ה</w:t>
       </w:r>
       <w:r>
-        <w:rPr>
-          <w:lang/>
-        </w:rPr>
         <w:t xml:space="preserve">-Worker </w:t>
       </w:r>
       <w:r>
@@ -10053,9 +10492,6 @@
         <w:t>יקראו את המשימות, ישלפו את הטוקנים הנדרשים מטבלת המכשירים, ויבצעו את השליחה ברקע ללא עיכוב של השרת הראשי</w:t>
       </w:r>
       <w:r>
-        <w:rPr>
-          <w:lang/>
-        </w:rPr>
         <w:t>.</w:t>
       </w:r>
     </w:p>
@@ -10066,9 +10502,6 @@
           <w:numId w:val="19"/>
         </w:numPr>
         <w:bidi/>
-        <w:rPr>
-          <w:lang/>
-        </w:rPr>
       </w:pPr>
       <w:r>
         <w:rPr>
@@ -10082,14 +10515,10 @@
         <w:rPr>
           <w:b/>
           <w:bCs/>
-          <w:lang/>
         </w:rPr>
         <w:t xml:space="preserve"> (Dead Letter Queue):</w:t>
       </w:r>
       <w:r>
-        <w:rPr>
-          <w:lang/>
-        </w:rPr>
         <w:t xml:space="preserve"> </w:t>
       </w:r>
       <w:r>
@@ -10099,9 +10528,6 @@
         <w:t>במידה ומשימה נכשלה</w:t>
       </w:r>
       <w:r>
-        <w:rPr>
-          <w:lang/>
-        </w:rPr>
         <w:t xml:space="preserve"> (</w:t>
       </w:r>
       <w:r>
@@ -10111,9 +10537,6 @@
         <w:t>לדוגמה, שרת הסינון של</w:t>
       </w:r>
       <w:r>
-        <w:rPr>
-          <w:lang/>
-        </w:rPr>
         <w:t xml:space="preserve"> Gemini </w:t>
       </w:r>
       <w:r>
@@ -10123,9 +10546,6 @@
         <w:t>חווה נפילה רגעית ולא הגיב</w:t>
       </w:r>
       <w:r>
-        <w:rPr>
-          <w:lang/>
-        </w:rPr>
         <w:t xml:space="preserve">), </w:t>
       </w:r>
       <w:r>
@@ -10135,9 +10555,6 @@
         <w:t>ה</w:t>
       </w:r>
       <w:r>
-        <w:rPr>
-          <w:lang/>
-        </w:rPr>
         <w:t xml:space="preserve">-Worker </w:t>
       </w:r>
       <w:r>
@@ -10147,9 +10564,6 @@
         <w:t>ינסה לבצע את המשימה שוב ושוב עד 3 פעמים. אם המשימה נכשלה סופית, היא תועבר אוטומטית לתור צדדי</w:t>
       </w:r>
       <w:r>
-        <w:rPr>
-          <w:lang/>
-        </w:rPr>
         <w:t xml:space="preserve"> (DLQ) </w:t>
       </w:r>
       <w:r>
@@ -10159,18 +10573,12 @@
         <w:t>כדי לא לתקוע את זרימת הפוסטים הרגילה במערכת וכדי לאפשר לנו לבדוק מה השתבש</w:t>
       </w:r>
       <w:r>
-        <w:rPr>
-          <w:lang/>
-        </w:rPr>
         <w:t>.</w:t>
       </w:r>
     </w:p>
     <w:p>
       <w:pPr>
         <w:bidi/>
-        <w:rPr>
-          <w:lang/>
-        </w:rPr>
       </w:pPr>
       <w:r>
         <w:rPr>
@@ -10184,14 +10592,10 @@
         <w:rPr>
           <w:b/>
           <w:bCs/>
-          <w:lang/>
         </w:rPr>
         <w:t xml:space="preserve"> (Scalability)</w:t>
       </w:r>
       <w:r>
-        <w:rPr>
-          <w:lang/>
-        </w:rPr>
         <w:t xml:space="preserve"> </w:t>
       </w:r>
       <w:r>
@@ -10201,9 +10605,6 @@
         <w:t>למרות השמירה הקפדנית על מסגרת ה</w:t>
       </w:r>
       <w:r>
-        <w:rPr>
-          <w:lang/>
-        </w:rPr>
         <w:t xml:space="preserve">-MVP, </w:t>
       </w:r>
       <w:r>
@@ -10213,9 +10614,6 @@
         <w:t>אנו מניחים תשתית ארכיטקטונית שתמנע מאיתנו לכתוב את הקוד מחדש כשהאפליקציה תצליח</w:t>
       </w:r>
       <w:r>
-        <w:rPr>
-          <w:lang/>
-        </w:rPr>
         <w:t>:</w:t>
       </w:r>
     </w:p>
@@ -10226,9 +10624,6 @@
           <w:numId w:val="20"/>
         </w:numPr>
         <w:bidi/>
-        <w:rPr>
-          <w:lang/>
-        </w:rPr>
       </w:pPr>
       <w:r>
         <w:rPr>
@@ -10242,14 +10637,10 @@
         <w:rPr>
           <w:b/>
           <w:bCs/>
-          <w:lang/>
         </w:rPr>
         <w:t xml:space="preserve"> (Redis Adapter):</w:t>
       </w:r>
       <w:r>
-        <w:rPr>
-          <w:lang/>
-        </w:rPr>
         <w:t xml:space="preserve"> </w:t>
       </w:r>
       <w:r>
@@ -10259,9 +10650,6 @@
         <w:t>שרת ה</w:t>
       </w:r>
       <w:r>
-        <w:rPr>
-          <w:lang/>
-        </w:rPr>
         <w:t xml:space="preserve">-Socket.io </w:t>
       </w:r>
       <w:r>
@@ -10271,9 +10659,6 @@
         <w:t>יוגדר מראש לעבודה עם</w:t>
       </w:r>
       <w:r>
-        <w:rPr>
-          <w:lang/>
-        </w:rPr>
         <w:t xml:space="preserve"> Redis Pub/Sub. </w:t>
       </w:r>
       <w:r>
@@ -10283,9 +10668,6 @@
         <w:t>כאשר נצטרך לשכפל את שרתי ה</w:t>
       </w:r>
       <w:r>
-        <w:rPr>
-          <w:lang/>
-        </w:rPr>
         <w:t xml:space="preserve">-Node.js </w:t>
       </w:r>
       <w:r>
@@ -10295,9 +10677,6 @@
         <w:t>מאחורי</w:t>
       </w:r>
       <w:r>
-        <w:rPr>
-          <w:lang/>
-        </w:rPr>
         <w:t xml:space="preserve"> Load Balancer </w:t>
       </w:r>
       <w:r>
@@ -10307,9 +10686,6 @@
         <w:t>בשלבי הפרודקשן</w:t>
       </w:r>
       <w:r>
-        <w:rPr>
-          <w:lang/>
-        </w:rPr>
         <w:t xml:space="preserve">, Redis </w:t>
       </w:r>
       <w:r>
@@ -10319,18 +10695,12 @@
         <w:t>ישמש כמתווך ויבטיח שהודעה שנשלחה ממשתמש המחובר לשרת א', תגיע בשבריר שנייה למשתמש השני שחבור באותו רגע לשרת ב</w:t>
       </w:r>
       <w:r>
-        <w:rPr>
-          <w:lang/>
-        </w:rPr>
         <w:t>'.</w:t>
       </w:r>
     </w:p>
     <w:p>
       <w:pPr>
         <w:bidi/>
-        <w:rPr>
-          <w:lang/>
-        </w:rPr>
       </w:pPr>
     </w:p>
     <w:p>
@@ -10447,39 +10817,20 @@
       <w:pPr>
         <w:bidi/>
         <w:rPr>
-          <w:rtl/>
-        </w:rPr>
-      </w:pPr>
-    </w:p>
-    <w:p>
-      <w:pPr>
-        <w:bidi/>
-        <w:rPr>
-          <w:rtl/>
-        </w:rPr>
-      </w:pPr>
-    </w:p>
-    <w:p>
-      <w:pPr>
-        <w:bidi/>
-        <w:rPr>
-          <w:rtl/>
-        </w:rPr>
-      </w:pPr>
-    </w:p>
-    <w:p>
-      <w:pPr>
-        <w:bidi/>
-        <w:rPr>
-          <w:b/>
-          <w:bCs/>
-          <w:lang/>
-        </w:rPr>
-      </w:pPr>
-      <w:r>
-        <w:rPr>
-          <w:b/>
-          <w:bCs/>
+          <w:b/>
+          <w:bCs/>
+          <w:sz w:val="32"/>
+          <w:szCs w:val="32"/>
+          <w:u w:val="single"/>
+        </w:rPr>
+      </w:pPr>
+      <w:r>
+        <w:rPr>
+          <w:b/>
+          <w:bCs/>
+          <w:sz w:val="32"/>
+          <w:szCs w:val="32"/>
+          <w:u w:val="single"/>
           <w:rtl/>
         </w:rPr>
         <w:lastRenderedPageBreak/>
@@ -10489,7 +10840,9 @@
         <w:rPr>
           <w:b/>
           <w:bCs/>
-          <w:lang/>
+          <w:sz w:val="32"/>
+          <w:szCs w:val="32"/>
+          <w:u w:val="single"/>
         </w:rPr>
         <w:t xml:space="preserve"> (Next.js SEO Web Portal)</w:t>
       </w:r>
@@ -10497,9 +10850,6 @@
     <w:p>
       <w:pPr>
         <w:bidi/>
-        <w:rPr>
-          <w:lang/>
-        </w:rPr>
       </w:pPr>
       <w:r>
         <w:rPr>
@@ -10508,9 +10858,6 @@
         <w:t>השלב הזה מתמקד בחלון הראווה הציבורי של האפליקציה. בניגוד לאפליקציית המובייל, כאן המטרה היא להיחשף למנועי חיפוש, לייצר תנועה אורגנית</w:t>
       </w:r>
       <w:r>
-        <w:rPr>
-          <w:lang/>
-        </w:rPr>
         <w:t xml:space="preserve"> (SEO), </w:t>
       </w:r>
       <w:r>
@@ -10520,18 +10867,12 @@
         <w:t>ולהמיר את הגולשים האקראיים למשתמשים פעילים שמורידים את האפליקציה אל מכשירי הקצה</w:t>
       </w:r>
       <w:r>
-        <w:rPr>
-          <w:lang/>
-        </w:rPr>
         <w:t>.</w:t>
       </w:r>
     </w:p>
     <w:p>
       <w:pPr>
         <w:bidi/>
-        <w:rPr>
-          <w:lang/>
-        </w:rPr>
       </w:pPr>
       <w:r>
         <w:rPr>
@@ -10545,14 +10886,10 @@
         <w:rPr>
           <w:b/>
           <w:bCs/>
-          <w:lang/>
         </w:rPr>
         <w:t xml:space="preserve"> (SSR)</w:t>
       </w:r>
       <w:r>
-        <w:rPr>
-          <w:lang/>
-        </w:rPr>
         <w:t xml:space="preserve"> </w:t>
       </w:r>
       <w:r>
@@ -10562,9 +10899,6 @@
         <w:t>כדי שמנועי חיפוש יוכלו לקרוא את התוכן שלנו בצורה מושלמת, נשתמש בטכנולוגיית רינדור צד שרת באמצעות</w:t>
       </w:r>
       <w:r>
-        <w:rPr>
-          <w:lang/>
-        </w:rPr>
         <w:t xml:space="preserve"> Next.js.</w:t>
       </w:r>
     </w:p>
@@ -10575,9 +10909,6 @@
           <w:numId w:val="21"/>
         </w:numPr>
         <w:bidi/>
-        <w:rPr>
-          <w:lang/>
-        </w:rPr>
       </w:pPr>
       <w:r>
         <w:rPr>
@@ -10591,14 +10922,10 @@
         <w:rPr>
           <w:b/>
           <w:bCs/>
-          <w:lang/>
         </w:rPr>
         <w:t>:</w:t>
       </w:r>
       <w:r>
-        <w:rPr>
-          <w:lang/>
-        </w:rPr>
         <w:t xml:space="preserve"> </w:t>
       </w:r>
       <w:r>
@@ -10608,9 +10935,6 @@
         <w:t>שרת ה</w:t>
       </w:r>
       <w:r>
-        <w:rPr>
-          <w:lang/>
-        </w:rPr>
         <w:t xml:space="preserve">-Next.js </w:t>
       </w:r>
       <w:r>
@@ -10620,9 +10944,6 @@
         <w:t>יפנה לשכבת ה</w:t>
       </w:r>
       <w:r>
-        <w:rPr>
-          <w:lang/>
-        </w:rPr>
         <w:t xml:space="preserve">-REST API </w:t>
       </w:r>
       <w:r>
@@ -10632,9 +10953,6 @@
         <w:t>שבנינו בשלב 4 (דרך הנתיב הייעודי לפורטל הציבורי), ימשוך את הנתונים, וייצר דף</w:t>
       </w:r>
       <w:r>
-        <w:rPr>
-          <w:lang/>
-        </w:rPr>
         <w:t xml:space="preserve"> HTML </w:t>
       </w:r>
       <w:r>
@@ -10644,9 +10962,6 @@
         <w:t>מלא עוד לפני שהלקוח (או הבוט של גוגל) מקבל את התשובה</w:t>
       </w:r>
       <w:r>
-        <w:rPr>
-          <w:lang/>
-        </w:rPr>
         <w:t>.</w:t>
       </w:r>
     </w:p>
@@ -10657,9 +10972,6 @@
           <w:numId w:val="21"/>
         </w:numPr>
         <w:bidi/>
-        <w:rPr>
-          <w:lang/>
-        </w:rPr>
       </w:pPr>
       <w:r>
         <w:rPr>
@@ -10673,14 +10985,10 @@
         <w:rPr>
           <w:b/>
           <w:bCs/>
-          <w:lang/>
         </w:rPr>
         <w:t xml:space="preserve"> (Meta Tags):</w:t>
       </w:r>
       <w:r>
-        <w:rPr>
-          <w:lang/>
-        </w:rPr>
         <w:t xml:space="preserve"> </w:t>
       </w:r>
       <w:r>
@@ -10690,9 +10998,6 @@
         <w:t>כל עמוד קבוצה או פוסט יקבל תגיות חכמות ותמונת תצוגה מקדימה</w:t>
       </w:r>
       <w:r>
-        <w:rPr>
-          <w:lang/>
-        </w:rPr>
         <w:t xml:space="preserve"> (Open Graph). </w:t>
       </w:r>
       <w:r>
@@ -10702,18 +11007,12 @@
         <w:t>כך, כאשר משתמשים ישתפו קישור לקבוצה בוואטסאפ או בטלגרם, התצוגה המקדימה תהיה עשירה ומזמינה ותמשוך חברים נוספים פנימה</w:t>
       </w:r>
       <w:r>
-        <w:rPr>
-          <w:lang/>
-        </w:rPr>
         <w:t>.</w:t>
       </w:r>
     </w:p>
     <w:p>
       <w:pPr>
         <w:bidi/>
-        <w:rPr>
-          <w:lang/>
-        </w:rPr>
       </w:pPr>
       <w:r>
         <w:rPr>
@@ -10727,14 +11026,10 @@
         <w:rPr>
           <w:b/>
           <w:bCs/>
-          <w:lang/>
         </w:rPr>
         <w:t xml:space="preserve"> (User Funnel)</w:t>
       </w:r>
       <w:r>
-        <w:rPr>
-          <w:lang/>
-        </w:rPr>
         <w:t xml:space="preserve"> </w:t>
       </w:r>
       <w:r>
@@ -10744,9 +11039,6 @@
         <w:t>הפורטל לא נועד להחליף את האפליקציה המלאה, אלא לשמש כטיזר (פיתיון). לכן, הפעולות בו יהיו מוגבלות לקריאה בלבד</w:t>
       </w:r>
       <w:r>
-        <w:rPr>
-          <w:lang/>
-        </w:rPr>
         <w:t xml:space="preserve"> (Read-Only).</w:t>
       </w:r>
     </w:p>
@@ -10757,9 +11049,6 @@
           <w:numId w:val="22"/>
         </w:numPr>
         <w:bidi/>
-        <w:rPr>
-          <w:lang/>
-        </w:rPr>
       </w:pPr>
       <w:r>
         <w:rPr>
@@ -10773,14 +11062,10 @@
         <w:rPr>
           <w:b/>
           <w:bCs/>
-          <w:lang/>
         </w:rPr>
         <w:t>:</w:t>
       </w:r>
       <w:r>
-        <w:rPr>
-          <w:lang/>
-        </w:rPr>
         <w:t xml:space="preserve"> </w:t>
       </w:r>
       <w:r>
@@ -10790,9 +11075,6 @@
         <w:t>כתובת אינטרנט ייעודית המציגה את שם הקבוצה, תיאור המטרה שלה, ורשימת הפוסטים האחרונים שעלו בה (מתוך קבוצות פתוחות בלבד)</w:t>
       </w:r>
       <w:r>
-        <w:rPr>
-          <w:lang/>
-        </w:rPr>
         <w:t>.</w:t>
       </w:r>
     </w:p>
@@ -10803,9 +11085,6 @@
           <w:numId w:val="22"/>
         </w:numPr>
         <w:bidi/>
-        <w:rPr>
-          <w:lang/>
-        </w:rPr>
       </w:pPr>
       <w:r>
         <w:rPr>
@@ -10819,14 +11098,10 @@
         <w:rPr>
           <w:b/>
           <w:bCs/>
-          <w:lang/>
         </w:rPr>
         <w:t>:</w:t>
       </w:r>
       <w:r>
-        <w:rPr>
-          <w:lang/>
-        </w:rPr>
         <w:t xml:space="preserve"> </w:t>
       </w:r>
       <w:r>
@@ -10836,9 +11111,6 @@
         <w:t>עמוד פנימי יותר המציג את תוכן הפוסט הספציפי וחלק מהתגובות המובילות אליו</w:t>
       </w:r>
       <w:r>
-        <w:rPr>
-          <w:lang/>
-        </w:rPr>
         <w:t>.</w:t>
       </w:r>
     </w:p>
@@ -10849,9 +11121,6 @@
           <w:numId w:val="22"/>
         </w:numPr>
         <w:bidi/>
-        <w:rPr>
-          <w:lang/>
-        </w:rPr>
       </w:pPr>
       <w:r>
         <w:rPr>
@@ -10865,14 +11134,10 @@
         <w:rPr>
           <w:b/>
           <w:bCs/>
-          <w:lang/>
         </w:rPr>
         <w:t>:</w:t>
       </w:r>
       <w:r>
-        <w:rPr>
-          <w:lang/>
-        </w:rPr>
         <w:t xml:space="preserve"> </w:t>
       </w:r>
       <w:r>
@@ -10882,9 +11147,6 @@
         <w:t>כל ניסיון לבצע פעולה אקטיבית בפורטל (כגון לחיצה על כפתור "לייק", ניסיון לכתוב תגובה או לחיצה על "הצטרף לקבוצה") יקפיץ מיד חלון מעוצב בממשק</w:t>
       </w:r>
       <w:r>
-        <w:rPr>
-          <w:lang/>
-        </w:rPr>
         <w:t xml:space="preserve"> (Pop-up) </w:t>
       </w:r>
       <w:r>
@@ -10894,9 +11156,6 @@
         <w:t>המזמין את המשתמש להוריד את האפליקציה מחנויות ה</w:t>
       </w:r>
       <w:r>
-        <w:rPr>
-          <w:lang/>
-        </w:rPr>
         <w:t xml:space="preserve">-App Store </w:t>
       </w:r>
       <w:r>
@@ -10906,9 +11165,6 @@
         <w:t>או</w:t>
       </w:r>
       <w:r>
-        <w:rPr>
-          <w:lang/>
-        </w:rPr>
         <w:t xml:space="preserve"> Google Play </w:t>
       </w:r>
       <w:r>
@@ -10918,18 +11174,12 @@
         <w:t>כדי להשתתף בדיון הפעיל</w:t>
       </w:r>
       <w:r>
-        <w:rPr>
-          <w:lang/>
-        </w:rPr>
         <w:t>.</w:t>
       </w:r>
     </w:p>
     <w:p>
       <w:pPr>
         <w:bidi/>
-        <w:rPr>
-          <w:lang/>
-        </w:rPr>
       </w:pPr>
       <w:r>
         <w:rPr>
@@ -10946,9 +11196,6 @@
         <w:t xml:space="preserve"> חשיפת נתונים לרשת הפתוחה דורשת זהירות כפולה ומכופלת כשמדובר ברשת חברתית הכוללת קהל צעיר</w:t>
       </w:r>
       <w:r>
-        <w:rPr>
-          <w:lang/>
-        </w:rPr>
         <w:t>.</w:t>
       </w:r>
     </w:p>
@@ -10959,9 +11206,6 @@
           <w:numId w:val="23"/>
         </w:numPr>
         <w:bidi/>
-        <w:rPr>
-          <w:lang/>
-        </w:rPr>
       </w:pPr>
       <w:r>
         <w:rPr>
@@ -10975,14 +11219,10 @@
         <w:rPr>
           <w:b/>
           <w:bCs/>
-          <w:lang/>
         </w:rPr>
         <w:t>:</w:t>
       </w:r>
       <w:r>
-        <w:rPr>
-          <w:lang/>
-        </w:rPr>
         <w:t xml:space="preserve"> </w:t>
       </w:r>
       <w:r>
@@ -10992,9 +11232,6 @@
         <w:t>ה</w:t>
       </w:r>
       <w:r>
-        <w:rPr>
-          <w:lang/>
-        </w:rPr>
         <w:t xml:space="preserve">-API </w:t>
       </w:r>
       <w:r>
@@ -11004,9 +11241,6 @@
         <w:t>הציבורי שלנו יסנן אוטומטית כל תוכן (פוסטים, תגובות או קבוצות) שנוצר על ידי משתמשים שגילם מוגדר כקטין (מתחת לגיל 18). מידע של משתמשים צעירים יישאר תמיד מוגן בתוך האפליקציה הסגורה ולא יאונדקס לעולם בגוגל</w:t>
       </w:r>
       <w:r>
-        <w:rPr>
-          <w:lang/>
-        </w:rPr>
         <w:t>.</w:t>
       </w:r>
     </w:p>
@@ -11017,9 +11251,6 @@
           <w:numId w:val="23"/>
         </w:numPr>
         <w:bidi/>
-        <w:rPr>
-          <w:lang/>
-        </w:rPr>
       </w:pPr>
       <w:r>
         <w:rPr>
@@ -11033,14 +11264,10 @@
         <w:rPr>
           <w:b/>
           <w:bCs/>
-          <w:lang/>
         </w:rPr>
         <w:t>-Scrapers:</w:t>
       </w:r>
       <w:r>
-        <w:rPr>
-          <w:lang/>
-        </w:rPr>
         <w:t xml:space="preserve"> </w:t>
       </w:r>
       <w:r>
@@ -11050,9 +11277,6 @@
         <w:t>הפורטל יוגבל בקצב פניות</w:t>
       </w:r>
       <w:r>
-        <w:rPr>
-          <w:lang/>
-        </w:rPr>
         <w:t xml:space="preserve"> (Rate Limiting) </w:t>
       </w:r>
       <w:r>
@@ -11062,18 +11286,12 @@
         <w:t>כדי למנוע מבוטים זדוניים או חברות מתחרות לשאוב את כל מאגר התוכן של הרשת החברתית בבת אחת</w:t>
       </w:r>
       <w:r>
-        <w:rPr>
-          <w:lang/>
-        </w:rPr>
         <w:t>.</w:t>
       </w:r>
     </w:p>
     <w:p>
       <w:pPr>
         <w:bidi/>
-        <w:rPr>
-          <w:lang/>
-        </w:rPr>
       </w:pPr>
       <w:r>
         <w:rPr>
@@ -11087,14 +11305,10 @@
         <w:rPr>
           <w:b/>
           <w:bCs/>
-          <w:lang/>
         </w:rPr>
         <w:t xml:space="preserve"> (SEO Indexing &amp; Canonicalization)</w:t>
       </w:r>
       <w:r>
-        <w:rPr>
-          <w:lang/>
-        </w:rPr>
         <w:t xml:space="preserve"> </w:t>
       </w:r>
       <w:r>
@@ -11104,9 +11318,6 @@
         <w:t>כדי שגוגל יבין את מבנה האתר במדויק ולא יעניש את הפלטפורמה על תוכן כפול</w:t>
       </w:r>
       <w:r>
-        <w:rPr>
-          <w:lang/>
-        </w:rPr>
         <w:t>:</w:t>
       </w:r>
     </w:p>
@@ -11117,9 +11328,6 @@
           <w:numId w:val="24"/>
         </w:numPr>
         <w:bidi/>
-        <w:rPr>
-          <w:lang/>
-        </w:rPr>
       </w:pPr>
       <w:r>
         <w:rPr>
@@ -11133,14 +11341,10 @@
         <w:rPr>
           <w:b/>
           <w:bCs/>
-          <w:lang/>
         </w:rPr>
         <w:t xml:space="preserve"> (Dynamic Sitemap.xml):</w:t>
       </w:r>
       <w:r>
-        <w:rPr>
-          <w:lang/>
-        </w:rPr>
         <w:t xml:space="preserve"> </w:t>
       </w:r>
       <w:r>
@@ -11150,9 +11354,6 @@
         <w:t>השרת ייצר אוטומטית קובץ מפת אתר דינמי שיעקוב ויציג קבוצות פומביות חדשות שנפתחות, כדי לעזור לזחלנים של גוגל למצוא ולאנדקס אותן מיד</w:t>
       </w:r>
       <w:r>
-        <w:rPr>
-          <w:lang/>
-        </w:rPr>
         <w:t>.</w:t>
       </w:r>
     </w:p>
@@ -11163,9 +11364,6 @@
           <w:numId w:val="24"/>
         </w:numPr>
         <w:bidi/>
-        <w:rPr>
-          <w:lang/>
-        </w:rPr>
       </w:pPr>
       <w:r>
         <w:rPr>
@@ -11179,7 +11377,6 @@
         <w:rPr>
           <w:b/>
           <w:bCs/>
-          <w:lang/>
         </w:rPr>
         <w:t xml:space="preserve"> Robots.txt </w:t>
       </w:r>
@@ -11195,14 +11392,10 @@
         <w:rPr>
           <w:b/>
           <w:bCs/>
-          <w:lang/>
         </w:rPr>
         <w:t>:</w:t>
       </w:r>
       <w:r>
-        <w:rPr>
-          <w:lang/>
-        </w:rPr>
         <w:t xml:space="preserve"> </w:t>
       </w:r>
       <w:r>
@@ -11212,9 +11405,6 @@
         <w:t>הגדרת הנחיות ברורות לבוטים אילו נתיבים מותר לאנדקס (קבוצות ופוסטים ציבוריים) ואילו נתיבים חסומים לחלוטין לסריקה (נתיבי מערכת פנימיים או דפי שגיאות)</w:t>
       </w:r>
       <w:r>
-        <w:rPr>
-          <w:lang/>
-        </w:rPr>
         <w:t>.</w:t>
       </w:r>
     </w:p>
@@ -11225,30 +11415,24 @@
           <w:numId w:val="24"/>
         </w:numPr>
         <w:bidi/>
-        <w:rPr>
-          <w:lang/>
-        </w:rPr>
-      </w:pPr>
-      <w:r>
-        <w:rPr>
-          <w:b/>
-          <w:bCs/>
-          <w:rtl/>
-        </w:rPr>
+      </w:pPr>
+      <w:r>
+        <w:rPr>
+          <w:b/>
+          <w:bCs/>
+          <w:rtl/>
+        </w:rPr>
+        <w:lastRenderedPageBreak/>
         <w:t>תגיות קנוניקל</w:t>
       </w:r>
       <w:r>
         <w:rPr>
           <w:b/>
           <w:bCs/>
-          <w:lang/>
         </w:rPr>
         <w:t xml:space="preserve"> (Canonical Tags):</w:t>
       </w:r>
       <w:r>
-        <w:rPr>
-          <w:lang/>
-        </w:rPr>
         <w:t xml:space="preserve"> </w:t>
       </w:r>
       <w:r>
@@ -11258,40 +11442,29 @@
         <w:t>הוספת תג קנוניקל לכל עמוד כדי לוודא שגוגל מבין מהי הכתובת המקורית והיחידה של הפוסט, מה שמונע פגיעה בדירוג האתר בגלל פרמטרים משתנים בשורת הכתובת (כמו מזהי שיתוף או סימוני עימוד משתנים)</w:t>
       </w:r>
       <w:r>
-        <w:rPr>
-          <w:lang/>
-        </w:rPr>
         <w:t>.</w:t>
       </w:r>
     </w:p>
     <w:p>
       <w:pPr>
         <w:bidi/>
-        <w:rPr>
-          <w:lang/>
-        </w:rPr>
-      </w:pPr>
-      <w:r>
-        <w:rPr>
-          <w:b/>
-          <w:bCs/>
-          <w:rtl/>
-        </w:rPr>
-        <w:lastRenderedPageBreak/>
+      </w:pPr>
+      <w:r>
+        <w:rPr>
+          <w:b/>
+          <w:bCs/>
+          <w:rtl/>
+        </w:rPr>
         <w:t>חלק ה': נתוני מבנה עשירים</w:t>
       </w:r>
       <w:r>
         <w:rPr>
           <w:b/>
           <w:bCs/>
-          <w:lang/>
         </w:rPr>
         <w:t xml:space="preserve"> (Structured Data / Schema.org)</w:t>
       </w:r>
       <w:r>
-        <w:rPr>
-          <w:lang/>
-        </w:rPr>
         <w:t xml:space="preserve"> </w:t>
       </w:r>
       <w:r>
@@ -11301,9 +11474,6 @@
         <w:t>כדי להציג את התוכן של האפליקציה בתוצאות החיפוש בצורה מתקדמת</w:t>
       </w:r>
       <w:r>
-        <w:rPr>
-          <w:lang/>
-        </w:rPr>
         <w:t xml:space="preserve"> (Rich Snippets) </w:t>
       </w:r>
       <w:r>
@@ -11313,9 +11483,6 @@
         <w:t>שמעלה משמעותית את אחוז הלחיצות של הגולשים</w:t>
       </w:r>
       <w:r>
-        <w:rPr>
-          <w:lang/>
-        </w:rPr>
         <w:t>:</w:t>
       </w:r>
     </w:p>
@@ -11326,9 +11493,6 @@
           <w:numId w:val="25"/>
         </w:numPr>
         <w:bidi/>
-        <w:rPr>
-          <w:lang/>
-        </w:rPr>
       </w:pPr>
       <w:r>
         <w:rPr>
@@ -11342,14 +11506,10 @@
         <w:rPr>
           <w:b/>
           <w:bCs/>
-          <w:lang/>
         </w:rPr>
         <w:t xml:space="preserve"> (DiscussionForumPosting):</w:t>
       </w:r>
       <w:r>
-        <w:rPr>
-          <w:lang/>
-        </w:rPr>
         <w:t xml:space="preserve"> </w:t>
       </w:r>
       <w:r>
@@ -11359,9 +11519,6 @@
         <w:t>נטמיע קוד</w:t>
       </w:r>
       <w:r>
-        <w:rPr>
-          <w:lang/>
-        </w:rPr>
         <w:t xml:space="preserve"> JSON-LD </w:t>
       </w:r>
       <w:r>
@@ -11371,18 +11528,12 @@
         <w:t>מובנה בכל עמוד פוסט בפורטל, המגדיר למנועי החיפוש בצורה ישירה מה מוגדר ככותרת, מי המחבר, מהו תוכן הפוסט, ואילו טקסטים הם תגובות של משתמשים אחרים, כדי שגוגל יציג את הדיון כבר במסך החיפוש שלו</w:t>
       </w:r>
       <w:r>
-        <w:rPr>
-          <w:lang/>
-        </w:rPr>
         <w:t>.</w:t>
       </w:r>
     </w:p>
     <w:p>
       <w:pPr>
         <w:bidi/>
-        <w:rPr>
-          <w:lang/>
-        </w:rPr>
       </w:pPr>
       <w:r>
         <w:rPr>
@@ -11396,14 +11547,10 @@
         <w:rPr>
           <w:b/>
           <w:bCs/>
-          <w:lang/>
         </w:rPr>
         <w:t xml:space="preserve"> (Performance &amp; Edge Caching)</w:t>
       </w:r>
       <w:r>
-        <w:rPr>
-          <w:lang/>
-        </w:rPr>
         <w:t xml:space="preserve"> </w:t>
       </w:r>
       <w:r>
@@ -11413,9 +11560,6 @@
         <w:t>מנועי חיפוש נותנים עדיפות גבוהה לאתרים שנטענים במהירות הבזק ומספקים חוויית גלישה יציבה</w:t>
       </w:r>
       <w:r>
-        <w:rPr>
-          <w:lang/>
-        </w:rPr>
         <w:t xml:space="preserve"> (Core Web Vitals):</w:t>
       </w:r>
     </w:p>
@@ -11426,9 +11570,6 @@
           <w:numId w:val="26"/>
         </w:numPr>
         <w:bidi/>
-        <w:rPr>
-          <w:lang/>
-        </w:rPr>
       </w:pPr>
       <w:r>
         <w:rPr>
@@ -11442,14 +11583,10 @@
         <w:rPr>
           <w:b/>
           <w:bCs/>
-          <w:lang/>
         </w:rPr>
         <w:t xml:space="preserve"> (Edge / CDN Caching):</w:t>
       </w:r>
       <w:r>
-        <w:rPr>
-          <w:lang/>
-        </w:rPr>
         <w:t xml:space="preserve"> </w:t>
       </w:r>
       <w:r>
@@ -11459,9 +11596,6 @@
         <w:t>כדי ששאילתות הרינדור</w:t>
       </w:r>
       <w:r>
-        <w:rPr>
-          <w:lang/>
-        </w:rPr>
         <w:t xml:space="preserve"> (SSR) </w:t>
       </w:r>
       <w:r>
@@ -11471,9 +11605,6 @@
         <w:t>לא יעיקו על שרת ה</w:t>
       </w:r>
       <w:r>
-        <w:rPr>
-          <w:lang/>
-        </w:rPr>
         <w:t xml:space="preserve">-Node.js </w:t>
       </w:r>
       <w:r>
@@ -11483,9 +11614,6 @@
         <w:t>הראשי בכל פעם שבוט של גוגל סורק פוסט (או כשיש גל כניסות זמני), נטמיע מנגנון מטמון קצר מועד</w:t>
       </w:r>
       <w:r>
-        <w:rPr>
-          <w:lang/>
-        </w:rPr>
         <w:t xml:space="preserve"> (</w:t>
       </w:r>
       <w:r>
@@ -11495,9 +11623,6 @@
         <w:t>באמצעות הגדרת כותרות</w:t>
       </w:r>
       <w:r>
-        <w:rPr>
-          <w:lang/>
-        </w:rPr>
         <w:t xml:space="preserve"> Cache-Control </w:t>
       </w:r>
       <w:r>
@@ -11507,9 +11632,6 @@
         <w:t>עם</w:t>
       </w:r>
       <w:r>
-        <w:rPr>
-          <w:lang/>
-        </w:rPr>
         <w:t xml:space="preserve"> stale-while-revalidate </w:t>
       </w:r>
       <w:r>
@@ -11519,9 +11641,6 @@
         <w:t>ל-5 דקות</w:t>
       </w:r>
       <w:r>
-        <w:rPr>
-          <w:lang/>
-        </w:rPr>
         <w:t xml:space="preserve">) </w:t>
       </w:r>
       <w:r>
@@ -11531,9 +11650,6 @@
         <w:t>ברמת ה</w:t>
       </w:r>
       <w:r>
-        <w:rPr>
-          <w:lang/>
-        </w:rPr>
         <w:t xml:space="preserve">-CDN. </w:t>
       </w:r>
       <w:r>
@@ -11543,18 +11659,12 @@
         <w:t>הדפים הציבוריים ייטענו באופן מיידי לחלוטין והשרת המרכזי יישאר פנוי לניהול האפליקציה</w:t>
       </w:r>
       <w:r>
-        <w:rPr>
-          <w:lang/>
-        </w:rPr>
         <w:t>.</w:t>
       </w:r>
     </w:p>
     <w:p>
       <w:pPr>
         <w:bidi/>
-        <w:rPr>
-          <w:lang/>
-        </w:rPr>
       </w:pPr>
       <w:r>
         <w:rPr>
@@ -11568,14 +11678,10 @@
         <w:rPr>
           <w:b/>
           <w:bCs/>
-          <w:lang/>
         </w:rPr>
         <w:t xml:space="preserve"> (Error Handling &amp; Retry)</w:t>
       </w:r>
       <w:r>
-        <w:rPr>
-          <w:lang/>
-        </w:rPr>
         <w:t xml:space="preserve"> </w:t>
       </w:r>
       <w:r>
@@ -11585,9 +11691,6 @@
         <w:t>גם בפורטל הרשת המינימלי שלנו, אנחנו שומרים על יציבות ושקיפות מלאה מול הגולש</w:t>
       </w:r>
       <w:r>
-        <w:rPr>
-          <w:lang/>
-        </w:rPr>
         <w:t>.</w:t>
       </w:r>
     </w:p>
@@ -11598,9 +11701,6 @@
           <w:numId w:val="27"/>
         </w:numPr>
         <w:bidi/>
-        <w:rPr>
-          <w:lang/>
-        </w:rPr>
       </w:pPr>
       <w:r>
         <w:rPr>
@@ -11614,14 +11714,10 @@
         <w:rPr>
           <w:b/>
           <w:bCs/>
-          <w:lang/>
         </w:rPr>
         <w:t xml:space="preserve"> (Retry):</w:t>
       </w:r>
       <w:r>
-        <w:rPr>
-          <w:lang/>
-        </w:rPr>
         <w:t xml:space="preserve"> </w:t>
       </w:r>
       <w:r>
@@ -11631,9 +11727,6 @@
         <w:t>עבור רכיבי לקוח</w:t>
       </w:r>
       <w:r>
-        <w:rPr>
-          <w:lang/>
-        </w:rPr>
         <w:t xml:space="preserve"> (Client Components) </w:t>
       </w:r>
       <w:r>
@@ -11643,9 +11736,6 @@
         <w:t>ב</w:t>
       </w:r>
       <w:r>
-        <w:rPr>
-          <w:lang/>
-        </w:rPr>
         <w:t xml:space="preserve">-Next.js </w:t>
       </w:r>
       <w:r>
@@ -11655,9 +11745,6 @@
         <w:t>שמושכים נתונים דינמיים, נטמיע מנגנון אוטומטי של עד 3 ניסיונות חוזרים למקרה של נפילת רשת או עומס רגעי בשרת</w:t>
       </w:r>
       <w:r>
-        <w:rPr>
-          <w:lang/>
-        </w:rPr>
         <w:t>.</w:t>
       </w:r>
     </w:p>
@@ -11670,7 +11757,6 @@
         <w:bidi/>
         <w:rPr>
           <w:rtl/>
-          <w:lang/>
         </w:rPr>
       </w:pPr>
       <w:r>
@@ -11685,14 +11771,10 @@
         <w:rPr>
           <w:b/>
           <w:bCs/>
-          <w:lang/>
         </w:rPr>
         <w:t xml:space="preserve"> (UI):</w:t>
       </w:r>
       <w:r>
-        <w:rPr>
-          <w:lang/>
-        </w:rPr>
         <w:t xml:space="preserve"> </w:t>
       </w:r>
       <w:r>
@@ -11702,9 +11784,6 @@
         <w:t>כלל הברזל שלנו ממשיך גם לכאן, אף שגיאת תקשורת לא תישאר חבויה בקונסול המפתחים באילמות. כל כישלון סופי בטעינת הנתונים יוצג לגולש בצורה ברורה על גבי המסך (לדוגמה דרך תיבה ויזואלית האומרת "החיבור נכשל, לחץ כאן לנסות שוב"), כדי שהגולש יבין בדיוק מה מצב המערכת</w:t>
       </w:r>
       <w:r>
-        <w:rPr>
-          <w:lang/>
-        </w:rPr>
         <w:t>.</w:t>
       </w:r>
     </w:p>
@@ -16943,23 +17022,6 @@
 </file>
 
 <file path=customXml/item1.xml><?xml version="1.0" encoding="utf-8"?>
-<p:properties xmlns:p="http://schemas.microsoft.com/office/2006/metadata/properties" xmlns:xsi="http://www.w3.org/2001/XMLSchema-instance" xmlns:pc="http://schemas.microsoft.com/office/infopath/2007/PartnerControls">
-  <documentManagement>
-    <_activity xmlns="75ed3cab-3afb-4117-85dd-44e2a12b383b" xsi:nil="true"/>
-  </documentManagement>
-</p:properties>
-</file>
-
-<file path=customXml/item2.xml><?xml version="1.0" encoding="utf-8"?>
-<?mso-contentType ?>
-<FormTemplates xmlns="http://schemas.microsoft.com/sharepoint/v3/contenttype/forms">
-  <Display>DocumentLibraryForm</Display>
-  <Edit>DocumentLibraryForm</Edit>
-  <New>DocumentLibraryForm</New>
-</FormTemplates>
-</file>
-
-<file path=customXml/item3.xml><?xml version="1.0" encoding="utf-8"?>
 <ct:contentTypeSchema xmlns:ct="http://schemas.microsoft.com/office/2006/metadata/contentType" xmlns:ma="http://schemas.microsoft.com/office/2006/metadata/properties/metaAttributes" ct:_="" ma:_="" ma:contentTypeName="Document" ma:contentTypeID="0x010100E46CF8CDFCFEDC4AA4D16DC214094B76" ma:contentTypeVersion="15" ma:contentTypeDescription="Create a new document." ma:contentTypeScope="" ma:versionID="1d6d3b0fbd2d2b4bd0272dd1bb5446ed">
   <xsd:schema xmlns:xsd="http://www.w3.org/2001/XMLSchema" xmlns:xs="http://www.w3.org/2001/XMLSchema" xmlns:p="http://schemas.microsoft.com/office/2006/metadata/properties" xmlns:ns3="75ed3cab-3afb-4117-85dd-44e2a12b383b" xmlns:ns4="e4fed794-6a0d-4fc7-8d97-da862ddf2a49" targetNamespace="http://schemas.microsoft.com/office/2006/metadata/properties" ma:root="true" ma:fieldsID="edd58c183cb980fd4281625d70db608d" ns3:_="" ns4:_="">
     <xsd:import namespace="75ed3cab-3afb-4117-85dd-44e2a12b383b"/>
@@ -17192,25 +17254,24 @@
 </ct:contentTypeSchema>
 </file>
 
-<file path=customXml/itemProps1.xml><?xml version="1.0" encoding="utf-8"?>
-<ds:datastoreItem xmlns:ds="http://schemas.openxmlformats.org/officeDocument/2006/customXml" ds:itemID="{1ABA3E6A-245D-4516-A739-F5C035445379}">
-  <ds:schemaRefs>
-    <ds:schemaRef ds:uri="http://schemas.microsoft.com/office/2006/metadata/properties"/>
-    <ds:schemaRef ds:uri="http://schemas.microsoft.com/office/infopath/2007/PartnerControls"/>
-    <ds:schemaRef ds:uri="75ed3cab-3afb-4117-85dd-44e2a12b383b"/>
-  </ds:schemaRefs>
-</ds:datastoreItem>
+<file path=customXml/item2.xml><?xml version="1.0" encoding="utf-8"?>
+<?mso-contentType ?>
+<FormTemplates xmlns="http://schemas.microsoft.com/sharepoint/v3/contenttype/forms">
+  <Display>DocumentLibraryForm</Display>
+  <Edit>DocumentLibraryForm</Edit>
+  <New>DocumentLibraryForm</New>
+</FormTemplates>
 </file>
 
-<file path=customXml/itemProps2.xml><?xml version="1.0" encoding="utf-8"?>
-<ds:datastoreItem xmlns:ds="http://schemas.openxmlformats.org/officeDocument/2006/customXml" ds:itemID="{AC5B62EE-5FF4-4FB2-B2AE-FBDE9F1B5C58}">
-  <ds:schemaRefs>
-    <ds:schemaRef ds:uri="http://schemas.microsoft.com/sharepoint/v3/contenttype/forms"/>
-  </ds:schemaRefs>
-</ds:datastoreItem>
+<file path=customXml/item3.xml><?xml version="1.0" encoding="utf-8"?>
+<p:properties xmlns:p="http://schemas.microsoft.com/office/2006/metadata/properties" xmlns:xsi="http://www.w3.org/2001/XMLSchema-instance" xmlns:pc="http://schemas.microsoft.com/office/infopath/2007/PartnerControls">
+  <documentManagement>
+    <_activity xmlns="75ed3cab-3afb-4117-85dd-44e2a12b383b" xsi:nil="true"/>
+  </documentManagement>
+</p:properties>
 </file>
 
-<file path=customXml/itemProps3.xml><?xml version="1.0" encoding="utf-8"?>
+<file path=customXml/itemProps1.xml><?xml version="1.0" encoding="utf-8"?>
 <ds:datastoreItem xmlns:ds="http://schemas.openxmlformats.org/officeDocument/2006/customXml" ds:itemID="{B6766DBA-84DF-467C-8C2D-98EF90AA2EA7}">
   <ds:schemaRefs>
     <ds:schemaRef ds:uri="http://schemas.microsoft.com/office/2006/metadata/contentType"/>
@@ -17227,4 +17288,22 @@
     <ds:schemaRef ds:uri="http://schemas.microsoft.com/internal/obd"/>
   </ds:schemaRefs>
 </ds:datastoreItem>
+</file>
+
+<file path=customXml/itemProps2.xml><?xml version="1.0" encoding="utf-8"?>
+<ds:datastoreItem xmlns:ds="http://schemas.openxmlformats.org/officeDocument/2006/customXml" ds:itemID="{AC5B62EE-5FF4-4FB2-B2AE-FBDE9F1B5C58}">
+  <ds:schemaRefs>
+    <ds:schemaRef ds:uri="http://schemas.microsoft.com/sharepoint/v3/contenttype/forms"/>
+  </ds:schemaRefs>
+</ds:datastoreItem>
+</file>
+
+<file path=customXml/itemProps3.xml><?xml version="1.0" encoding="utf-8"?>
+<ds:datastoreItem xmlns:ds="http://schemas.openxmlformats.org/officeDocument/2006/customXml" ds:itemID="{1ABA3E6A-245D-4516-A739-F5C035445379}">
+  <ds:schemaRefs>
+    <ds:schemaRef ds:uri="http://schemas.microsoft.com/office/2006/metadata/properties"/>
+    <ds:schemaRef ds:uri="http://schemas.microsoft.com/office/infopath/2007/PartnerControls"/>
+    <ds:schemaRef ds:uri="75ed3cab-3afb-4117-85dd-44e2a12b383b"/>
+  </ds:schemaRefs>
+</ds:datastoreItem>
 </file>
</xml_diff>